<commit_message>
Disclose that the seniority table is keyed on the analyst name alone
The report counts run to 6,805 records for one name, which no single person files, so one
name collects several people. An analyst sharing a name with a veteran inherits that
veteran's first report date, which overstates seniority for the namesake.

Co-Authored-By: Claude Fable 5.1 <noreply@anthropic.com>
</commit_message>
<xml_diff>
--- a/Project10_Star_Analyst_Research_Plan_EN.docx
+++ b/Project10_Star_Analyst_Research_Plan_EN.docx
@@ -202,7 +202,7 @@
         </w:rPr>
         <w:fldChar w:fldCharType="separate"/>
       </w:r>
-      <w:hyperlink w:anchor="_Toc242175843" w:history="1">
+      <w:hyperlink w:anchor="_Toc242200318" w:history="1">
         <w:r>
           <w:rPr>
             <w:rStyle w:val="aff9"/>
@@ -240,7 +240,7 @@
             <w:noProof/>
             <w:webHidden/>
           </w:rPr>
-          <w:instrText>PAGEREF _Toc242175843 \h</w:instrText>
+          <w:instrText>PAGEREF _Toc242200318 \h</w:instrText>
         </w:r>
         <w:r>
           <w:rPr>
@@ -298,7 +298,7 @@
           <w14:ligatures w14:val="standardContextual"/>
         </w:rPr>
       </w:pPr>
-      <w:hyperlink w:anchor="_Toc242175844" w:history="1">
+      <w:hyperlink w:anchor="_Toc242200319" w:history="1">
         <w:r>
           <w:rPr>
             <w:rStyle w:val="aff9"/>
@@ -336,7 +336,7 @@
             <w:noProof/>
             <w:webHidden/>
           </w:rPr>
-          <w:instrText>PAGEREF _Toc242175844 \h</w:instrText>
+          <w:instrText>PAGEREF _Toc242200319 \h</w:instrText>
         </w:r>
         <w:r>
           <w:rPr>
@@ -394,7 +394,7 @@
           <w14:ligatures w14:val="standardContextual"/>
         </w:rPr>
       </w:pPr>
-      <w:hyperlink w:anchor="_Toc242175845" w:history="1">
+      <w:hyperlink w:anchor="_Toc242200320" w:history="1">
         <w:r>
           <w:rPr>
             <w:rStyle w:val="aff9"/>
@@ -432,7 +432,7 @@
             <w:noProof/>
             <w:webHidden/>
           </w:rPr>
-          <w:instrText>PAGEREF _Toc242175845 \h</w:instrText>
+          <w:instrText>PAGEREF _Toc242200320 \h</w:instrText>
         </w:r>
         <w:r>
           <w:rPr>
@@ -490,7 +490,7 @@
           <w14:ligatures w14:val="standardContextual"/>
         </w:rPr>
       </w:pPr>
-      <w:hyperlink w:anchor="_Toc242175846" w:history="1">
+      <w:hyperlink w:anchor="_Toc242200321" w:history="1">
         <w:r>
           <w:rPr>
             <w:rStyle w:val="aff9"/>
@@ -528,7 +528,7 @@
             <w:noProof/>
             <w:webHidden/>
           </w:rPr>
-          <w:instrText>PAGEREF _Toc242175846 \h</w:instrText>
+          <w:instrText>PAGEREF _Toc242200321 \h</w:instrText>
         </w:r>
         <w:r>
           <w:rPr>
@@ -586,7 +586,7 @@
           <w14:ligatures w14:val="standardContextual"/>
         </w:rPr>
       </w:pPr>
-      <w:hyperlink w:anchor="_Toc242175847" w:history="1">
+      <w:hyperlink w:anchor="_Toc242200322" w:history="1">
         <w:r>
           <w:rPr>
             <w:rStyle w:val="aff9"/>
@@ -624,7 +624,7 @@
             <w:noProof/>
             <w:webHidden/>
           </w:rPr>
-          <w:instrText>PAGEREF _Toc242175847 \h</w:instrText>
+          <w:instrText>PAGEREF _Toc242200322 \h</w:instrText>
         </w:r>
         <w:r>
           <w:rPr>
@@ -682,7 +682,7 @@
           <w14:ligatures w14:val="standardContextual"/>
         </w:rPr>
       </w:pPr>
-      <w:hyperlink w:anchor="_Toc242175848" w:history="1">
+      <w:hyperlink w:anchor="_Toc242200323" w:history="1">
         <w:r>
           <w:rPr>
             <w:rStyle w:val="aff9"/>
@@ -720,7 +720,7 @@
             <w:noProof/>
             <w:webHidden/>
           </w:rPr>
-          <w:instrText>PAGEREF _Toc242175848 \h</w:instrText>
+          <w:instrText>PAGEREF _Toc242200323 \h</w:instrText>
         </w:r>
         <w:r>
           <w:rPr>
@@ -778,7 +778,7 @@
           <w14:ligatures w14:val="standardContextual"/>
         </w:rPr>
       </w:pPr>
-      <w:hyperlink w:anchor="_Toc242175849" w:history="1">
+      <w:hyperlink w:anchor="_Toc242200324" w:history="1">
         <w:r>
           <w:rPr>
             <w:rStyle w:val="aff9"/>
@@ -816,7 +816,7 @@
             <w:noProof/>
             <w:webHidden/>
           </w:rPr>
-          <w:instrText>PAGEREF _Toc242175849 \h</w:instrText>
+          <w:instrText>PAGEREF _Toc242200324 \h</w:instrText>
         </w:r>
         <w:r>
           <w:rPr>
@@ -874,7 +874,7 @@
           <w14:ligatures w14:val="standardContextual"/>
         </w:rPr>
       </w:pPr>
-      <w:hyperlink w:anchor="_Toc242175850" w:history="1">
+      <w:hyperlink w:anchor="_Toc242200325" w:history="1">
         <w:r>
           <w:rPr>
             <w:rStyle w:val="aff9"/>
@@ -912,7 +912,7 @@
             <w:noProof/>
             <w:webHidden/>
           </w:rPr>
-          <w:instrText>PAGEREF _Toc242175850 \h</w:instrText>
+          <w:instrText>PAGEREF _Toc242200325 \h</w:instrText>
         </w:r>
         <w:r>
           <w:rPr>
@@ -970,7 +970,7 @@
           <w14:ligatures w14:val="standardContextual"/>
         </w:rPr>
       </w:pPr>
-      <w:hyperlink w:anchor="_Toc242175851" w:history="1">
+      <w:hyperlink w:anchor="_Toc242200326" w:history="1">
         <w:r>
           <w:rPr>
             <w:rStyle w:val="aff9"/>
@@ -1008,7 +1008,7 @@
             <w:noProof/>
             <w:webHidden/>
           </w:rPr>
-          <w:instrText>PAGEREF _Toc242175851 \h</w:instrText>
+          <w:instrText>PAGEREF _Toc242200326 \h</w:instrText>
         </w:r>
         <w:r>
           <w:rPr>
@@ -1066,7 +1066,7 @@
           <w14:ligatures w14:val="standardContextual"/>
         </w:rPr>
       </w:pPr>
-      <w:hyperlink w:anchor="_Toc242175852" w:history="1">
+      <w:hyperlink w:anchor="_Toc242200327" w:history="1">
         <w:r>
           <w:rPr>
             <w:rStyle w:val="aff9"/>
@@ -1104,7 +1104,7 @@
             <w:noProof/>
             <w:webHidden/>
           </w:rPr>
-          <w:instrText>PAGEREF _Toc242175852 \h</w:instrText>
+          <w:instrText>PAGEREF _Toc242200327 \h</w:instrText>
         </w:r>
         <w:r>
           <w:rPr>
@@ -1162,7 +1162,7 @@
           <w14:ligatures w14:val="standardContextual"/>
         </w:rPr>
       </w:pPr>
-      <w:hyperlink w:anchor="_Toc242175853" w:history="1">
+      <w:hyperlink w:anchor="_Toc242200328" w:history="1">
         <w:r>
           <w:rPr>
             <w:rStyle w:val="aff9"/>
@@ -1200,7 +1200,7 @@
             <w:noProof/>
             <w:webHidden/>
           </w:rPr>
-          <w:instrText>PAGEREF _Toc242175853 \h</w:instrText>
+          <w:instrText>PAGEREF _Toc242200328 \h</w:instrText>
         </w:r>
         <w:r>
           <w:rPr>
@@ -1258,7 +1258,7 @@
           <w14:ligatures w14:val="standardContextual"/>
         </w:rPr>
       </w:pPr>
-      <w:hyperlink w:anchor="_Toc242175854" w:history="1">
+      <w:hyperlink w:anchor="_Toc242200329" w:history="1">
         <w:r>
           <w:rPr>
             <w:rStyle w:val="aff9"/>
@@ -1296,7 +1296,7 @@
             <w:noProof/>
             <w:webHidden/>
           </w:rPr>
-          <w:instrText>PAGEREF _Toc242175854 \h</w:instrText>
+          <w:instrText>PAGEREF _Toc242200329 \h</w:instrText>
         </w:r>
         <w:r>
           <w:rPr>
@@ -1354,7 +1354,7 @@
           <w14:ligatures w14:val="standardContextual"/>
         </w:rPr>
       </w:pPr>
-      <w:hyperlink w:anchor="_Toc242175855" w:history="1">
+      <w:hyperlink w:anchor="_Toc242200330" w:history="1">
         <w:r>
           <w:rPr>
             <w:rStyle w:val="aff9"/>
@@ -1392,7 +1392,7 @@
             <w:noProof/>
             <w:webHidden/>
           </w:rPr>
-          <w:instrText>PAGEREF _Toc242175855 \h</w:instrText>
+          <w:instrText>PAGEREF _Toc242200330 \h</w:instrText>
         </w:r>
         <w:r>
           <w:rPr>
@@ -1450,7 +1450,7 @@
           <w14:ligatures w14:val="standardContextual"/>
         </w:rPr>
       </w:pPr>
-      <w:hyperlink w:anchor="_Toc242175856" w:history="1">
+      <w:hyperlink w:anchor="_Toc242200331" w:history="1">
         <w:r>
           <w:rPr>
             <w:rStyle w:val="aff9"/>
@@ -1488,7 +1488,7 @@
             <w:noProof/>
             <w:webHidden/>
           </w:rPr>
-          <w:instrText>PAGEREF _Toc242175856 \h</w:instrText>
+          <w:instrText>PAGEREF _Toc242200331 \h</w:instrText>
         </w:r>
         <w:r>
           <w:rPr>
@@ -1543,7 +1543,7 @@
         <w:pStyle w:val="1"/>
         <w:spacing w:before="280" w:after="120"/>
       </w:pPr>
-      <w:bookmarkStart w:id="0" w:name="_Toc242175843"/>
+      <w:bookmarkStart w:id="0" w:name="_Toc242200318"/>
       <w:r>
         <w:rPr>
           <w:rFonts w:ascii="Times New Roman" w:eastAsia="Arial" w:hAnsi="Times New Roman"/>
@@ -1992,7 +1992,7 @@
         <w:pStyle w:val="1"/>
         <w:spacing w:before="280" w:after="120"/>
       </w:pPr>
-      <w:bookmarkStart w:id="1" w:name="_Toc242175844"/>
+      <w:bookmarkStart w:id="1" w:name="_Toc242200319"/>
       <w:r>
         <w:rPr>
           <w:rFonts w:ascii="Times New Roman" w:eastAsia="Arial" w:hAnsi="Times New Roman"/>
@@ -2040,7 +2040,7 @@
         <w:pStyle w:val="1"/>
         <w:spacing w:before="280" w:after="120"/>
       </w:pPr>
-      <w:bookmarkStart w:id="2" w:name="_Toc242175845"/>
+      <w:bookmarkStart w:id="2" w:name="_Toc242200320"/>
       <w:r>
         <w:rPr>
           <w:rFonts w:ascii="Times New Roman" w:eastAsia="Arial" w:hAnsi="Times New Roman"/>
@@ -2460,7 +2460,7 @@
         <w:pStyle w:val="1"/>
         <w:spacing w:before="280" w:after="120"/>
       </w:pPr>
-      <w:bookmarkStart w:id="3" w:name="_Toc242175846"/>
+      <w:bookmarkStart w:id="3" w:name="_Toc242200321"/>
       <w:r>
         <w:rPr>
           <w:rFonts w:ascii="Times New Roman" w:eastAsia="Arial" w:hAnsi="Times New Roman"/>
@@ -2967,7 +2967,7 @@
         <w:pStyle w:val="1"/>
         <w:spacing w:before="280" w:after="120"/>
       </w:pPr>
-      <w:bookmarkStart w:id="4" w:name="_Toc242175847"/>
+      <w:bookmarkStart w:id="4" w:name="_Toc242200322"/>
       <w:r>
         <w:rPr>
           <w:rFonts w:ascii="Times New Roman" w:eastAsia="Arial" w:hAnsi="Times New Roman"/>
@@ -3421,7 +3421,7 @@
         <w:pStyle w:val="1"/>
         <w:spacing w:before="280" w:after="120"/>
       </w:pPr>
-      <w:bookmarkStart w:id="5" w:name="_Toc242175848"/>
+      <w:bookmarkStart w:id="5" w:name="_Toc242200323"/>
       <w:r>
         <w:rPr>
           <w:rFonts w:ascii="Times New Roman" w:eastAsia="Arial" w:hAnsi="Times New Roman"/>
@@ -3593,7 +3593,7 @@
         <w:pStyle w:val="1"/>
         <w:spacing w:before="280" w:after="120"/>
       </w:pPr>
-      <w:bookmarkStart w:id="6" w:name="_Toc242175849"/>
+      <w:bookmarkStart w:id="6" w:name="_Toc242200324"/>
       <w:r>
         <w:rPr>
           <w:rFonts w:ascii="Times New Roman" w:eastAsia="Arial" w:hAnsi="Times New Roman"/>
@@ -3799,7 +3799,7 @@
         <w:pStyle w:val="1"/>
         <w:spacing w:before="280" w:after="120"/>
       </w:pPr>
-      <w:bookmarkStart w:id="7" w:name="_Toc242175850"/>
+      <w:bookmarkStart w:id="7" w:name="_Toc242200325"/>
       <w:r>
         <w:rPr>
           <w:rFonts w:ascii="Times New Roman" w:eastAsia="Arial" w:hAnsi="Times New Roman"/>
@@ -3943,7 +3943,7 @@
         <w:pStyle w:val="1"/>
         <w:spacing w:before="280" w:after="120"/>
       </w:pPr>
-      <w:bookmarkStart w:id="8" w:name="_Toc242175851"/>
+      <w:bookmarkStart w:id="8" w:name="_Toc242200326"/>
       <w:r>
         <w:rPr>
           <w:rFonts w:ascii="Times New Roman" w:eastAsia="Arial" w:hAnsi="Times New Roman"/>
@@ -4252,7 +4252,7 @@
         <w:pStyle w:val="1"/>
         <w:spacing w:before="280" w:after="120"/>
       </w:pPr>
-      <w:bookmarkStart w:id="9" w:name="_Toc242175852"/>
+      <w:bookmarkStart w:id="9" w:name="_Toc242200327"/>
       <w:r>
         <w:rPr>
           <w:rFonts w:ascii="Times New Roman" w:eastAsia="Arial" w:hAnsi="Times New Roman"/>
@@ -4348,7 +4348,7 @@
         <w:pStyle w:val="1"/>
         <w:spacing w:before="280" w:after="120"/>
       </w:pPr>
-      <w:bookmarkStart w:id="10" w:name="_Toc242175853"/>
+      <w:bookmarkStart w:id="10" w:name="_Toc242200328"/>
       <w:r>
         <w:rPr>
           <w:rFonts w:ascii="Times New Roman" w:eastAsia="Arial" w:hAnsi="Times New Roman"/>
@@ -4454,7 +4454,7 @@
         <w:pStyle w:val="1"/>
         <w:spacing w:before="280" w:after="120"/>
       </w:pPr>
-      <w:bookmarkStart w:id="11" w:name="_Toc242175854"/>
+      <w:bookmarkStart w:id="11" w:name="_Toc242200329"/>
       <w:r>
         <w:rPr>
           <w:rFonts w:ascii="Times New Roman" w:eastAsia="Arial" w:hAnsi="Times New Roman"/>
@@ -4619,7 +4619,7 @@
         <w:pStyle w:val="1"/>
         <w:spacing w:before="280" w:after="120"/>
       </w:pPr>
-      <w:bookmarkStart w:id="12" w:name="_Toc242175855"/>
+      <w:bookmarkStart w:id="12" w:name="_Toc242200330"/>
       <w:r>
         <w:rPr>
           <w:rFonts w:ascii="Times New Roman" w:eastAsia="Arial" w:hAnsi="Times New Roman"/>
@@ -4857,7 +4857,7 @@
         <w:pStyle w:val="1"/>
         <w:spacing w:before="280" w:after="120"/>
       </w:pPr>
-      <w:bookmarkStart w:id="13" w:name="_Toc242175856"/>
+      <w:bookmarkStart w:id="13" w:name="_Toc242200331"/>
       <w:r>
         <w:rPr>
           <w:rFonts w:ascii="Times New Roman" w:eastAsia="Arial" w:hAnsi="Times New Roman"/>
@@ -5297,6 +5297,42 @@
           <w:color w:val="000000"/>
         </w:rPr>
         <w:t>.</w:t>
+      </w:r>
+    </w:p>
+    <w:p>
+      <w:pPr>
+        <w:pStyle w:val="a0"/>
+        <w:spacing w:after="60"/>
+      </w:pPr>
+      <w:r>
+        <w:rPr>
+          <w:rFonts w:ascii="Consolas" w:hAnsi="Consolas"/>
+          <w:color w:val="000000"/>
+          <w:sz w:val="22"/>
+        </w:rPr>
+        <w:t>资历</w:t>
+      </w:r>
+      <w:r>
+        <w:rPr>
+          <w:color w:val="000000"/>
+        </w:rPr>
+        <w:t xml:space="preserve"> is keyed on the analyst name alone, so an analyst who shares a name with a veteran</w:t>
+      </w:r>
+    </w:p>
+    <w:p>
+      <w:r>
+        <w:rPr>
+          <w:color w:val="000000"/>
+        </w:rPr>
+        <w:t>inherits that veteran's first report date and the seniority is overstated. The report</w:t>
+      </w:r>
+    </w:p>
+    <w:p>
+      <w:r>
+        <w:rPr>
+          <w:color w:val="000000"/>
+        </w:rPr>
+        <w:t>counts show such names exist: the largest reach 6,805 records, which no one person files.</w:t>
       </w:r>
     </w:p>
     <w:sectPr>
@@ -5580,31 +5616,31 @@
       </w:rPr>
     </w:lvl>
   </w:abstractNum>
-  <w:num w:numId="1" w16cid:durableId="1686638905">
+  <w:num w:numId="1" w16cid:durableId="816149158">
     <w:abstractNumId w:val="8"/>
   </w:num>
-  <w:num w:numId="2" w16cid:durableId="855001765">
+  <w:num w:numId="2" w16cid:durableId="586160746">
     <w:abstractNumId w:val="6"/>
   </w:num>
-  <w:num w:numId="3" w16cid:durableId="2077824421">
+  <w:num w:numId="3" w16cid:durableId="231081839">
     <w:abstractNumId w:val="5"/>
   </w:num>
-  <w:num w:numId="4" w16cid:durableId="1970083694">
+  <w:num w:numId="4" w16cid:durableId="2006009813">
     <w:abstractNumId w:val="4"/>
   </w:num>
-  <w:num w:numId="5" w16cid:durableId="528026291">
+  <w:num w:numId="5" w16cid:durableId="2049793999">
     <w:abstractNumId w:val="7"/>
   </w:num>
-  <w:num w:numId="6" w16cid:durableId="49230355">
+  <w:num w:numId="6" w16cid:durableId="761075038">
     <w:abstractNumId w:val="3"/>
   </w:num>
-  <w:num w:numId="7" w16cid:durableId="773666974">
+  <w:num w:numId="7" w16cid:durableId="939029198">
     <w:abstractNumId w:val="2"/>
   </w:num>
-  <w:num w:numId="8" w16cid:durableId="1646080212">
+  <w:num w:numId="8" w16cid:durableId="1860199573">
     <w:abstractNumId w:val="1"/>
   </w:num>
-  <w:num w:numId="9" w16cid:durableId="1656766072">
+  <w:num w:numId="9" w16cid:durableId="1152216783">
     <w:abstractNumId w:val="0"/>
   </w:num>
 </w:numbering>
@@ -17003,14 +17039,14 @@
     <w:autoRedefine/>
     <w:uiPriority w:val="39"/>
     <w:unhideWhenUsed/>
-    <w:rsid w:val="00E719D2"/>
+    <w:rsid w:val="00452AB0"/>
   </w:style>
   <w:style w:type="character" w:styleId="aff9">
     <w:name w:val="Hyperlink"/>
     <w:basedOn w:val="a2"/>
     <w:uiPriority w:val="99"/>
     <w:unhideWhenUsed/>
-    <w:rsid w:val="00E719D2"/>
+    <w:rsid w:val="00452AB0"/>
     <w:rPr>
       <w:color w:val="0000FF" w:themeColor="hyperlink"/>
       <w:u w:val="single"/>

</xml_diff>

<commit_message>
State the star rule as implemented: the list of the event year, 2018 inheriting 2017
The plan table said "in force at the report date", which describes the month-split
convention rather than the default star_inforce.

Co-Authored-By: Claude Fable 5.1 <noreply@anthropic.com>
</commit_message>
<xml_diff>
--- a/Project10_Star_Analyst_Research_Plan_EN.docx
+++ b/Project10_Star_Analyst_Research_Plan_EN.docx
@@ -202,7 +202,7 @@
         </w:rPr>
         <w:fldChar w:fldCharType="separate"/>
       </w:r>
-      <w:hyperlink w:anchor="_Toc242200318" w:history="1">
+      <w:hyperlink w:anchor="_Toc242208228" w:history="1">
         <w:r>
           <w:rPr>
             <w:rStyle w:val="aff9"/>
@@ -240,7 +240,7 @@
             <w:noProof/>
             <w:webHidden/>
           </w:rPr>
-          <w:instrText>PAGEREF _Toc242200318 \h</w:instrText>
+          <w:instrText>PAGEREF _Toc242208228 \h</w:instrText>
         </w:r>
         <w:r>
           <w:rPr>
@@ -298,7 +298,7 @@
           <w14:ligatures w14:val="standardContextual"/>
         </w:rPr>
       </w:pPr>
-      <w:hyperlink w:anchor="_Toc242200319" w:history="1">
+      <w:hyperlink w:anchor="_Toc242208229" w:history="1">
         <w:r>
           <w:rPr>
             <w:rStyle w:val="aff9"/>
@@ -336,7 +336,7 @@
             <w:noProof/>
             <w:webHidden/>
           </w:rPr>
-          <w:instrText>PAGEREF _Toc242200319 \h</w:instrText>
+          <w:instrText>PAGEREF _Toc242208229 \h</w:instrText>
         </w:r>
         <w:r>
           <w:rPr>
@@ -394,7 +394,7 @@
           <w14:ligatures w14:val="standardContextual"/>
         </w:rPr>
       </w:pPr>
-      <w:hyperlink w:anchor="_Toc242200320" w:history="1">
+      <w:hyperlink w:anchor="_Toc242208230" w:history="1">
         <w:r>
           <w:rPr>
             <w:rStyle w:val="aff9"/>
@@ -432,7 +432,7 @@
             <w:noProof/>
             <w:webHidden/>
           </w:rPr>
-          <w:instrText>PAGEREF _Toc242200320 \h</w:instrText>
+          <w:instrText>PAGEREF _Toc242208230 \h</w:instrText>
         </w:r>
         <w:r>
           <w:rPr>
@@ -490,7 +490,7 @@
           <w14:ligatures w14:val="standardContextual"/>
         </w:rPr>
       </w:pPr>
-      <w:hyperlink w:anchor="_Toc242200321" w:history="1">
+      <w:hyperlink w:anchor="_Toc242208231" w:history="1">
         <w:r>
           <w:rPr>
             <w:rStyle w:val="aff9"/>
@@ -528,7 +528,7 @@
             <w:noProof/>
             <w:webHidden/>
           </w:rPr>
-          <w:instrText>PAGEREF _Toc242200321 \h</w:instrText>
+          <w:instrText>PAGEREF _Toc242208231 \h</w:instrText>
         </w:r>
         <w:r>
           <w:rPr>
@@ -586,7 +586,7 @@
           <w14:ligatures w14:val="standardContextual"/>
         </w:rPr>
       </w:pPr>
-      <w:hyperlink w:anchor="_Toc242200322" w:history="1">
+      <w:hyperlink w:anchor="_Toc242208232" w:history="1">
         <w:r>
           <w:rPr>
             <w:rStyle w:val="aff9"/>
@@ -624,7 +624,7 @@
             <w:noProof/>
             <w:webHidden/>
           </w:rPr>
-          <w:instrText>PAGEREF _Toc242200322 \h</w:instrText>
+          <w:instrText>PAGEREF _Toc242208232 \h</w:instrText>
         </w:r>
         <w:r>
           <w:rPr>
@@ -682,7 +682,7 @@
           <w14:ligatures w14:val="standardContextual"/>
         </w:rPr>
       </w:pPr>
-      <w:hyperlink w:anchor="_Toc242200323" w:history="1">
+      <w:hyperlink w:anchor="_Toc242208233" w:history="1">
         <w:r>
           <w:rPr>
             <w:rStyle w:val="aff9"/>
@@ -720,7 +720,7 @@
             <w:noProof/>
             <w:webHidden/>
           </w:rPr>
-          <w:instrText>PAGEREF _Toc242200323 \h</w:instrText>
+          <w:instrText>PAGEREF _Toc242208233 \h</w:instrText>
         </w:r>
         <w:r>
           <w:rPr>
@@ -778,7 +778,7 @@
           <w14:ligatures w14:val="standardContextual"/>
         </w:rPr>
       </w:pPr>
-      <w:hyperlink w:anchor="_Toc242200324" w:history="1">
+      <w:hyperlink w:anchor="_Toc242208234" w:history="1">
         <w:r>
           <w:rPr>
             <w:rStyle w:val="aff9"/>
@@ -816,7 +816,7 @@
             <w:noProof/>
             <w:webHidden/>
           </w:rPr>
-          <w:instrText>PAGEREF _Toc242200324 \h</w:instrText>
+          <w:instrText>PAGEREF _Toc242208234 \h</w:instrText>
         </w:r>
         <w:r>
           <w:rPr>
@@ -874,7 +874,7 @@
           <w14:ligatures w14:val="standardContextual"/>
         </w:rPr>
       </w:pPr>
-      <w:hyperlink w:anchor="_Toc242200325" w:history="1">
+      <w:hyperlink w:anchor="_Toc242208235" w:history="1">
         <w:r>
           <w:rPr>
             <w:rStyle w:val="aff9"/>
@@ -912,7 +912,7 @@
             <w:noProof/>
             <w:webHidden/>
           </w:rPr>
-          <w:instrText>PAGEREF _Toc242200325 \h</w:instrText>
+          <w:instrText>PAGEREF _Toc242208235 \h</w:instrText>
         </w:r>
         <w:r>
           <w:rPr>
@@ -970,7 +970,7 @@
           <w14:ligatures w14:val="standardContextual"/>
         </w:rPr>
       </w:pPr>
-      <w:hyperlink w:anchor="_Toc242200326" w:history="1">
+      <w:hyperlink w:anchor="_Toc242208236" w:history="1">
         <w:r>
           <w:rPr>
             <w:rStyle w:val="aff9"/>
@@ -1008,7 +1008,7 @@
             <w:noProof/>
             <w:webHidden/>
           </w:rPr>
-          <w:instrText>PAGEREF _Toc242200326 \h</w:instrText>
+          <w:instrText>PAGEREF _Toc242208236 \h</w:instrText>
         </w:r>
         <w:r>
           <w:rPr>
@@ -1066,7 +1066,7 @@
           <w14:ligatures w14:val="standardContextual"/>
         </w:rPr>
       </w:pPr>
-      <w:hyperlink w:anchor="_Toc242200327" w:history="1">
+      <w:hyperlink w:anchor="_Toc242208237" w:history="1">
         <w:r>
           <w:rPr>
             <w:rStyle w:val="aff9"/>
@@ -1104,7 +1104,7 @@
             <w:noProof/>
             <w:webHidden/>
           </w:rPr>
-          <w:instrText>PAGEREF _Toc242200327 \h</w:instrText>
+          <w:instrText>PAGEREF _Toc242208237 \h</w:instrText>
         </w:r>
         <w:r>
           <w:rPr>
@@ -1162,7 +1162,7 @@
           <w14:ligatures w14:val="standardContextual"/>
         </w:rPr>
       </w:pPr>
-      <w:hyperlink w:anchor="_Toc242200328" w:history="1">
+      <w:hyperlink w:anchor="_Toc242208238" w:history="1">
         <w:r>
           <w:rPr>
             <w:rStyle w:val="aff9"/>
@@ -1200,7 +1200,7 @@
             <w:noProof/>
             <w:webHidden/>
           </w:rPr>
-          <w:instrText>PAGEREF _Toc242200328 \h</w:instrText>
+          <w:instrText>PAGEREF _Toc242208238 \h</w:instrText>
         </w:r>
         <w:r>
           <w:rPr>
@@ -1258,7 +1258,7 @@
           <w14:ligatures w14:val="standardContextual"/>
         </w:rPr>
       </w:pPr>
-      <w:hyperlink w:anchor="_Toc242200329" w:history="1">
+      <w:hyperlink w:anchor="_Toc242208239" w:history="1">
         <w:r>
           <w:rPr>
             <w:rStyle w:val="aff9"/>
@@ -1296,7 +1296,7 @@
             <w:noProof/>
             <w:webHidden/>
           </w:rPr>
-          <w:instrText>PAGEREF _Toc242200329 \h</w:instrText>
+          <w:instrText>PAGEREF _Toc242208239 \h</w:instrText>
         </w:r>
         <w:r>
           <w:rPr>
@@ -1354,7 +1354,7 @@
           <w14:ligatures w14:val="standardContextual"/>
         </w:rPr>
       </w:pPr>
-      <w:hyperlink w:anchor="_Toc242200330" w:history="1">
+      <w:hyperlink w:anchor="_Toc242208240" w:history="1">
         <w:r>
           <w:rPr>
             <w:rStyle w:val="aff9"/>
@@ -1392,7 +1392,7 @@
             <w:noProof/>
             <w:webHidden/>
           </w:rPr>
-          <w:instrText>PAGEREF _Toc242200330 \h</w:instrText>
+          <w:instrText>PAGEREF _Toc242208240 \h</w:instrText>
         </w:r>
         <w:r>
           <w:rPr>
@@ -1450,7 +1450,7 @@
           <w14:ligatures w14:val="standardContextual"/>
         </w:rPr>
       </w:pPr>
-      <w:hyperlink w:anchor="_Toc242200331" w:history="1">
+      <w:hyperlink w:anchor="_Toc242208241" w:history="1">
         <w:r>
           <w:rPr>
             <w:rStyle w:val="aff9"/>
@@ -1488,7 +1488,7 @@
             <w:noProof/>
             <w:webHidden/>
           </w:rPr>
-          <w:instrText>PAGEREF _Toc242200331 \h</w:instrText>
+          <w:instrText>PAGEREF _Toc242208241 \h</w:instrText>
         </w:r>
         <w:r>
           <w:rPr>
@@ -1543,7 +1543,7 @@
         <w:pStyle w:val="1"/>
         <w:spacing w:before="280" w:after="120"/>
       </w:pPr>
-      <w:bookmarkStart w:id="0" w:name="_Toc242200318"/>
+      <w:bookmarkStart w:id="0" w:name="_Toc242208228"/>
       <w:r>
         <w:rPr>
           <w:rFonts w:ascii="Times New Roman" w:eastAsia="Arial" w:hAnsi="Times New Roman"/>
@@ -1992,7 +1992,7 @@
         <w:pStyle w:val="1"/>
         <w:spacing w:before="280" w:after="120"/>
       </w:pPr>
-      <w:bookmarkStart w:id="1" w:name="_Toc242200319"/>
+      <w:bookmarkStart w:id="1" w:name="_Toc242208229"/>
       <w:r>
         <w:rPr>
           <w:rFonts w:ascii="Times New Roman" w:eastAsia="Arial" w:hAnsi="Times New Roman"/>
@@ -2040,7 +2040,7 @@
         <w:pStyle w:val="1"/>
         <w:spacing w:before="280" w:after="120"/>
       </w:pPr>
-      <w:bookmarkStart w:id="2" w:name="_Toc242200320"/>
+      <w:bookmarkStart w:id="2" w:name="_Toc242208230"/>
       <w:r>
         <w:rPr>
           <w:rFonts w:ascii="Times New Roman" w:eastAsia="Arial" w:hAnsi="Times New Roman"/>
@@ -2460,7 +2460,7 @@
         <w:pStyle w:val="1"/>
         <w:spacing w:before="280" w:after="120"/>
       </w:pPr>
-      <w:bookmarkStart w:id="3" w:name="_Toc242200321"/>
+      <w:bookmarkStart w:id="3" w:name="_Toc242208231"/>
       <w:r>
         <w:rPr>
           <w:rFonts w:ascii="Times New Roman" w:eastAsia="Arial" w:hAnsi="Times New Roman"/>
@@ -2967,7 +2967,7 @@
         <w:pStyle w:val="1"/>
         <w:spacing w:before="280" w:after="120"/>
       </w:pPr>
-      <w:bookmarkStart w:id="4" w:name="_Toc242200322"/>
+      <w:bookmarkStart w:id="4" w:name="_Toc242208232"/>
       <w:r>
         <w:rPr>
           <w:rFonts w:ascii="Times New Roman" w:eastAsia="Arial" w:hAnsi="Times New Roman"/>
@@ -3098,7 +3098,7 @@
                 <w:color w:val="000000"/>
                 <w:sz w:val="21"/>
               </w:rPr>
-              <w:t>1 if the analyst is in the New Fortune Best Analyst list in force at the report date</w:t>
+              <w:t>1 if the analyst is in the New Fortune Best Analyst list of the event year, with 2018 inheriting the 2017 list</w:t>
             </w:r>
           </w:p>
         </w:tc>
@@ -3421,7 +3421,7 @@
         <w:pStyle w:val="1"/>
         <w:spacing w:before="280" w:after="120"/>
       </w:pPr>
-      <w:bookmarkStart w:id="5" w:name="_Toc242200323"/>
+      <w:bookmarkStart w:id="5" w:name="_Toc242208233"/>
       <w:r>
         <w:rPr>
           <w:rFonts w:ascii="Times New Roman" w:eastAsia="Arial" w:hAnsi="Times New Roman"/>
@@ -3593,7 +3593,7 @@
         <w:pStyle w:val="1"/>
         <w:spacing w:before="280" w:after="120"/>
       </w:pPr>
-      <w:bookmarkStart w:id="6" w:name="_Toc242200324"/>
+      <w:bookmarkStart w:id="6" w:name="_Toc242208234"/>
       <w:r>
         <w:rPr>
           <w:rFonts w:ascii="Times New Roman" w:eastAsia="Arial" w:hAnsi="Times New Roman"/>
@@ -3799,7 +3799,7 @@
         <w:pStyle w:val="1"/>
         <w:spacing w:before="280" w:after="120"/>
       </w:pPr>
-      <w:bookmarkStart w:id="7" w:name="_Toc242200325"/>
+      <w:bookmarkStart w:id="7" w:name="_Toc242208235"/>
       <w:r>
         <w:rPr>
           <w:rFonts w:ascii="Times New Roman" w:eastAsia="Arial" w:hAnsi="Times New Roman"/>
@@ -3943,7 +3943,7 @@
         <w:pStyle w:val="1"/>
         <w:spacing w:before="280" w:after="120"/>
       </w:pPr>
-      <w:bookmarkStart w:id="8" w:name="_Toc242200326"/>
+      <w:bookmarkStart w:id="8" w:name="_Toc242208236"/>
       <w:r>
         <w:rPr>
           <w:rFonts w:ascii="Times New Roman" w:eastAsia="Arial" w:hAnsi="Times New Roman"/>
@@ -4252,7 +4252,7 @@
         <w:pStyle w:val="1"/>
         <w:spacing w:before="280" w:after="120"/>
       </w:pPr>
-      <w:bookmarkStart w:id="9" w:name="_Toc242200327"/>
+      <w:bookmarkStart w:id="9" w:name="_Toc242208237"/>
       <w:r>
         <w:rPr>
           <w:rFonts w:ascii="Times New Roman" w:eastAsia="Arial" w:hAnsi="Times New Roman"/>
@@ -4348,7 +4348,7 @@
         <w:pStyle w:val="1"/>
         <w:spacing w:before="280" w:after="120"/>
       </w:pPr>
-      <w:bookmarkStart w:id="10" w:name="_Toc242200328"/>
+      <w:bookmarkStart w:id="10" w:name="_Toc242208238"/>
       <w:r>
         <w:rPr>
           <w:rFonts w:ascii="Times New Roman" w:eastAsia="Arial" w:hAnsi="Times New Roman"/>
@@ -4454,7 +4454,7 @@
         <w:pStyle w:val="1"/>
         <w:spacing w:before="280" w:after="120"/>
       </w:pPr>
-      <w:bookmarkStart w:id="11" w:name="_Toc242200329"/>
+      <w:bookmarkStart w:id="11" w:name="_Toc242208239"/>
       <w:r>
         <w:rPr>
           <w:rFonts w:ascii="Times New Roman" w:eastAsia="Arial" w:hAnsi="Times New Roman"/>
@@ -4619,7 +4619,7 @@
         <w:pStyle w:val="1"/>
         <w:spacing w:before="280" w:after="120"/>
       </w:pPr>
-      <w:bookmarkStart w:id="12" w:name="_Toc242200330"/>
+      <w:bookmarkStart w:id="12" w:name="_Toc242208240"/>
       <w:r>
         <w:rPr>
           <w:rFonts w:ascii="Times New Roman" w:eastAsia="Arial" w:hAnsi="Times New Roman"/>
@@ -4857,7 +4857,7 @@
         <w:pStyle w:val="1"/>
         <w:spacing w:before="280" w:after="120"/>
       </w:pPr>
-      <w:bookmarkStart w:id="13" w:name="_Toc242200331"/>
+      <w:bookmarkStart w:id="13" w:name="_Toc242208241"/>
       <w:r>
         <w:rPr>
           <w:rFonts w:ascii="Times New Roman" w:eastAsia="Arial" w:hAnsi="Times New Roman"/>
@@ -5616,31 +5616,31 @@
       </w:rPr>
     </w:lvl>
   </w:abstractNum>
-  <w:num w:numId="1" w16cid:durableId="816149158">
+  <w:num w:numId="1" w16cid:durableId="445391548">
     <w:abstractNumId w:val="8"/>
   </w:num>
-  <w:num w:numId="2" w16cid:durableId="586160746">
+  <w:num w:numId="2" w16cid:durableId="640159101">
     <w:abstractNumId w:val="6"/>
   </w:num>
-  <w:num w:numId="3" w16cid:durableId="231081839">
+  <w:num w:numId="3" w16cid:durableId="828786945">
     <w:abstractNumId w:val="5"/>
   </w:num>
-  <w:num w:numId="4" w16cid:durableId="2006009813">
+  <w:num w:numId="4" w16cid:durableId="822543364">
     <w:abstractNumId w:val="4"/>
   </w:num>
-  <w:num w:numId="5" w16cid:durableId="2049793999">
+  <w:num w:numId="5" w16cid:durableId="1179348027">
     <w:abstractNumId w:val="7"/>
   </w:num>
-  <w:num w:numId="6" w16cid:durableId="761075038">
+  <w:num w:numId="6" w16cid:durableId="1933466661">
     <w:abstractNumId w:val="3"/>
   </w:num>
-  <w:num w:numId="7" w16cid:durableId="939029198">
+  <w:num w:numId="7" w16cid:durableId="717703325">
     <w:abstractNumId w:val="2"/>
   </w:num>
-  <w:num w:numId="8" w16cid:durableId="1860199573">
+  <w:num w:numId="8" w16cid:durableId="115029674">
     <w:abstractNumId w:val="1"/>
   </w:num>
-  <w:num w:numId="9" w16cid:durableId="1152216783">
+  <w:num w:numId="9" w16cid:durableId="1135753254">
     <w:abstractNumId w:val="0"/>
   </w:num>
 </w:numbering>
@@ -17039,14 +17039,14 @@
     <w:autoRedefine/>
     <w:uiPriority w:val="39"/>
     <w:unhideWhenUsed/>
-    <w:rsid w:val="00452AB0"/>
+    <w:rsid w:val="00B61236"/>
   </w:style>
   <w:style w:type="character" w:styleId="aff9">
     <w:name w:val="Hyperlink"/>
     <w:basedOn w:val="a2"/>
     <w:uiPriority w:val="99"/>
     <w:unhideWhenUsed/>
-    <w:rsid w:val="00452AB0"/>
+    <w:rsid w:val="00B61236"/>
     <w:rPr>
       <w:color w:val="0000FF" w:themeColor="hyperlink"/>
       <w:u w:val="single"/>

</xml_diff>

<commit_message>
Correct a misspelled analyst name in the star match and sync the counts
The scraped list wrote the 海通证券 machinery analyst 佘炜超 as 余炜超, so five 2019 events
were coded star = 0. The rating detail writes 佘炜超 in all 641 of his records and 余炜超
in none, so the list spelling is canonicalised through broker_names.canonical_analyst.
star = 1 goes from 2,767 to 2,772 and the 2019 share from 14.3% to 14.5%. Found by
cross-checking the market side's roster.

Co-Authored-By: Claude Fable 5.1 <noreply@anthropic.com>
</commit_message>
<xml_diff>
--- a/Project10_Star_Analyst_Research_Plan_EN.docx
+++ b/Project10_Star_Analyst_Research_Plan_EN.docx
@@ -202,7 +202,7 @@
         </w:rPr>
         <w:fldChar w:fldCharType="separate"/>
       </w:r>
-      <w:hyperlink w:anchor="_Toc242208228" w:history="1">
+      <w:hyperlink w:anchor="_Toc242212710" w:history="1">
         <w:r>
           <w:rPr>
             <w:rStyle w:val="aff9"/>
@@ -240,7 +240,7 @@
             <w:noProof/>
             <w:webHidden/>
           </w:rPr>
-          <w:instrText>PAGEREF _Toc242208228 \h</w:instrText>
+          <w:instrText>PAGEREF _Toc242212710 \h</w:instrText>
         </w:r>
         <w:r>
           <w:rPr>
@@ -298,7 +298,7 @@
           <w14:ligatures w14:val="standardContextual"/>
         </w:rPr>
       </w:pPr>
-      <w:hyperlink w:anchor="_Toc242208229" w:history="1">
+      <w:hyperlink w:anchor="_Toc242212711" w:history="1">
         <w:r>
           <w:rPr>
             <w:rStyle w:val="aff9"/>
@@ -336,7 +336,7 @@
             <w:noProof/>
             <w:webHidden/>
           </w:rPr>
-          <w:instrText>PAGEREF _Toc242208229 \h</w:instrText>
+          <w:instrText>PAGEREF _Toc242212711 \h</w:instrText>
         </w:r>
         <w:r>
           <w:rPr>
@@ -394,7 +394,7 @@
           <w14:ligatures w14:val="standardContextual"/>
         </w:rPr>
       </w:pPr>
-      <w:hyperlink w:anchor="_Toc242208230" w:history="1">
+      <w:hyperlink w:anchor="_Toc242212712" w:history="1">
         <w:r>
           <w:rPr>
             <w:rStyle w:val="aff9"/>
@@ -432,7 +432,7 @@
             <w:noProof/>
             <w:webHidden/>
           </w:rPr>
-          <w:instrText>PAGEREF _Toc242208230 \h</w:instrText>
+          <w:instrText>PAGEREF _Toc242212712 \h</w:instrText>
         </w:r>
         <w:r>
           <w:rPr>
@@ -490,7 +490,7 @@
           <w14:ligatures w14:val="standardContextual"/>
         </w:rPr>
       </w:pPr>
-      <w:hyperlink w:anchor="_Toc242208231" w:history="1">
+      <w:hyperlink w:anchor="_Toc242212713" w:history="1">
         <w:r>
           <w:rPr>
             <w:rStyle w:val="aff9"/>
@@ -528,7 +528,7 @@
             <w:noProof/>
             <w:webHidden/>
           </w:rPr>
-          <w:instrText>PAGEREF _Toc242208231 \h</w:instrText>
+          <w:instrText>PAGEREF _Toc242212713 \h</w:instrText>
         </w:r>
         <w:r>
           <w:rPr>
@@ -586,7 +586,7 @@
           <w14:ligatures w14:val="standardContextual"/>
         </w:rPr>
       </w:pPr>
-      <w:hyperlink w:anchor="_Toc242208232" w:history="1">
+      <w:hyperlink w:anchor="_Toc242212714" w:history="1">
         <w:r>
           <w:rPr>
             <w:rStyle w:val="aff9"/>
@@ -624,7 +624,7 @@
             <w:noProof/>
             <w:webHidden/>
           </w:rPr>
-          <w:instrText>PAGEREF _Toc242208232 \h</w:instrText>
+          <w:instrText>PAGEREF _Toc242212714 \h</w:instrText>
         </w:r>
         <w:r>
           <w:rPr>
@@ -682,7 +682,7 @@
           <w14:ligatures w14:val="standardContextual"/>
         </w:rPr>
       </w:pPr>
-      <w:hyperlink w:anchor="_Toc242208233" w:history="1">
+      <w:hyperlink w:anchor="_Toc242212715" w:history="1">
         <w:r>
           <w:rPr>
             <w:rStyle w:val="aff9"/>
@@ -720,7 +720,7 @@
             <w:noProof/>
             <w:webHidden/>
           </w:rPr>
-          <w:instrText>PAGEREF _Toc242208233 \h</w:instrText>
+          <w:instrText>PAGEREF _Toc242212715 \h</w:instrText>
         </w:r>
         <w:r>
           <w:rPr>
@@ -778,7 +778,7 @@
           <w14:ligatures w14:val="standardContextual"/>
         </w:rPr>
       </w:pPr>
-      <w:hyperlink w:anchor="_Toc242208234" w:history="1">
+      <w:hyperlink w:anchor="_Toc242212716" w:history="1">
         <w:r>
           <w:rPr>
             <w:rStyle w:val="aff9"/>
@@ -816,7 +816,7 @@
             <w:noProof/>
             <w:webHidden/>
           </w:rPr>
-          <w:instrText>PAGEREF _Toc242208234 \h</w:instrText>
+          <w:instrText>PAGEREF _Toc242212716 \h</w:instrText>
         </w:r>
         <w:r>
           <w:rPr>
@@ -874,7 +874,7 @@
           <w14:ligatures w14:val="standardContextual"/>
         </w:rPr>
       </w:pPr>
-      <w:hyperlink w:anchor="_Toc242208235" w:history="1">
+      <w:hyperlink w:anchor="_Toc242212717" w:history="1">
         <w:r>
           <w:rPr>
             <w:rStyle w:val="aff9"/>
@@ -912,7 +912,7 @@
             <w:noProof/>
             <w:webHidden/>
           </w:rPr>
-          <w:instrText>PAGEREF _Toc242208235 \h</w:instrText>
+          <w:instrText>PAGEREF _Toc242212717 \h</w:instrText>
         </w:r>
         <w:r>
           <w:rPr>
@@ -970,7 +970,7 @@
           <w14:ligatures w14:val="standardContextual"/>
         </w:rPr>
       </w:pPr>
-      <w:hyperlink w:anchor="_Toc242208236" w:history="1">
+      <w:hyperlink w:anchor="_Toc242212718" w:history="1">
         <w:r>
           <w:rPr>
             <w:rStyle w:val="aff9"/>
@@ -1008,7 +1008,7 @@
             <w:noProof/>
             <w:webHidden/>
           </w:rPr>
-          <w:instrText>PAGEREF _Toc242208236 \h</w:instrText>
+          <w:instrText>PAGEREF _Toc242212718 \h</w:instrText>
         </w:r>
         <w:r>
           <w:rPr>
@@ -1066,7 +1066,7 @@
           <w14:ligatures w14:val="standardContextual"/>
         </w:rPr>
       </w:pPr>
-      <w:hyperlink w:anchor="_Toc242208237" w:history="1">
+      <w:hyperlink w:anchor="_Toc242212719" w:history="1">
         <w:r>
           <w:rPr>
             <w:rStyle w:val="aff9"/>
@@ -1104,7 +1104,7 @@
             <w:noProof/>
             <w:webHidden/>
           </w:rPr>
-          <w:instrText>PAGEREF _Toc242208237 \h</w:instrText>
+          <w:instrText>PAGEREF _Toc242212719 \h</w:instrText>
         </w:r>
         <w:r>
           <w:rPr>
@@ -1162,7 +1162,7 @@
           <w14:ligatures w14:val="standardContextual"/>
         </w:rPr>
       </w:pPr>
-      <w:hyperlink w:anchor="_Toc242208238" w:history="1">
+      <w:hyperlink w:anchor="_Toc242212720" w:history="1">
         <w:r>
           <w:rPr>
             <w:rStyle w:val="aff9"/>
@@ -1200,7 +1200,7 @@
             <w:noProof/>
             <w:webHidden/>
           </w:rPr>
-          <w:instrText>PAGEREF _Toc242208238 \h</w:instrText>
+          <w:instrText>PAGEREF _Toc242212720 \h</w:instrText>
         </w:r>
         <w:r>
           <w:rPr>
@@ -1258,7 +1258,7 @@
           <w14:ligatures w14:val="standardContextual"/>
         </w:rPr>
       </w:pPr>
-      <w:hyperlink w:anchor="_Toc242208239" w:history="1">
+      <w:hyperlink w:anchor="_Toc242212721" w:history="1">
         <w:r>
           <w:rPr>
             <w:rStyle w:val="aff9"/>
@@ -1296,7 +1296,7 @@
             <w:noProof/>
             <w:webHidden/>
           </w:rPr>
-          <w:instrText>PAGEREF _Toc242208239 \h</w:instrText>
+          <w:instrText>PAGEREF _Toc242212721 \h</w:instrText>
         </w:r>
         <w:r>
           <w:rPr>
@@ -1354,7 +1354,7 @@
           <w14:ligatures w14:val="standardContextual"/>
         </w:rPr>
       </w:pPr>
-      <w:hyperlink w:anchor="_Toc242208240" w:history="1">
+      <w:hyperlink w:anchor="_Toc242212722" w:history="1">
         <w:r>
           <w:rPr>
             <w:rStyle w:val="aff9"/>
@@ -1392,7 +1392,7 @@
             <w:noProof/>
             <w:webHidden/>
           </w:rPr>
-          <w:instrText>PAGEREF _Toc242208240 \h</w:instrText>
+          <w:instrText>PAGEREF _Toc242212722 \h</w:instrText>
         </w:r>
         <w:r>
           <w:rPr>
@@ -1450,7 +1450,7 @@
           <w14:ligatures w14:val="standardContextual"/>
         </w:rPr>
       </w:pPr>
-      <w:hyperlink w:anchor="_Toc242208241" w:history="1">
+      <w:hyperlink w:anchor="_Toc242212723" w:history="1">
         <w:r>
           <w:rPr>
             <w:rStyle w:val="aff9"/>
@@ -1488,7 +1488,7 @@
             <w:noProof/>
             <w:webHidden/>
           </w:rPr>
-          <w:instrText>PAGEREF _Toc242208241 \h</w:instrText>
+          <w:instrText>PAGEREF _Toc242212723 \h</w:instrText>
         </w:r>
         <w:r>
           <w:rPr>
@@ -1543,7 +1543,7 @@
         <w:pStyle w:val="1"/>
         <w:spacing w:before="280" w:after="120"/>
       </w:pPr>
-      <w:bookmarkStart w:id="0" w:name="_Toc242208228"/>
+      <w:bookmarkStart w:id="0" w:name="_Toc242212710"/>
       <w:r>
         <w:rPr>
           <w:rFonts w:ascii="Times New Roman" w:eastAsia="Arial" w:hAnsi="Times New Roman"/>
@@ -1992,7 +1992,7 @@
         <w:pStyle w:val="1"/>
         <w:spacing w:before="280" w:after="120"/>
       </w:pPr>
-      <w:bookmarkStart w:id="1" w:name="_Toc242208229"/>
+      <w:bookmarkStart w:id="1" w:name="_Toc242212711"/>
       <w:r>
         <w:rPr>
           <w:rFonts w:ascii="Times New Roman" w:eastAsia="Arial" w:hAnsi="Times New Roman"/>
@@ -2040,7 +2040,7 @@
         <w:pStyle w:val="1"/>
         <w:spacing w:before="280" w:after="120"/>
       </w:pPr>
-      <w:bookmarkStart w:id="2" w:name="_Toc242208230"/>
+      <w:bookmarkStart w:id="2" w:name="_Toc242212712"/>
       <w:r>
         <w:rPr>
           <w:rFonts w:ascii="Times New Roman" w:eastAsia="Arial" w:hAnsi="Times New Roman"/>
@@ -2460,7 +2460,7 @@
         <w:pStyle w:val="1"/>
         <w:spacing w:before="280" w:after="120"/>
       </w:pPr>
-      <w:bookmarkStart w:id="3" w:name="_Toc242208231"/>
+      <w:bookmarkStart w:id="3" w:name="_Toc242212713"/>
       <w:r>
         <w:rPr>
           <w:rFonts w:ascii="Times New Roman" w:eastAsia="Arial" w:hAnsi="Times New Roman"/>
@@ -2967,7 +2967,7 @@
         <w:pStyle w:val="1"/>
         <w:spacing w:before="280" w:after="120"/>
       </w:pPr>
-      <w:bookmarkStart w:id="4" w:name="_Toc242208232"/>
+      <w:bookmarkStart w:id="4" w:name="_Toc242212714"/>
       <w:r>
         <w:rPr>
           <w:rFonts w:ascii="Times New Roman" w:eastAsia="Arial" w:hAnsi="Times New Roman"/>
@@ -3305,15 +3305,15 @@
         <w:rPr>
           <w:color w:val="000000"/>
         </w:rPr>
-        <w:t xml:space="preserve"> for 2,767 of 20,980 events (13.2%), and the share is stable across years:</w:t>
-      </w:r>
-    </w:p>
-    <w:p>
-      <w:r>
-        <w:rPr>
-          <w:color w:val="000000"/>
-        </w:rPr>
-        <w:t>13.4%, 14.3%, 13.5%, 13.6%, 13.6%, 11.8%, 11.6% for 2018-2024.</w:t>
+        <w:t xml:space="preserve"> for 2,772 of 20,980 events (13.2%), and the share is stable across years:</w:t>
+      </w:r>
+    </w:p>
+    <w:p>
+      <w:r>
+        <w:rPr>
+          <w:color w:val="000000"/>
+        </w:rPr>
+        <w:t>13.4%, 14.5%, 13.5%, 13.6%, 13.6%, 11.8%, 11.6% for 2018-2024.</w:t>
       </w:r>
     </w:p>
     <w:p>
@@ -3421,7 +3421,7 @@
         <w:pStyle w:val="1"/>
         <w:spacing w:before="280" w:after="120"/>
       </w:pPr>
-      <w:bookmarkStart w:id="5" w:name="_Toc242208233"/>
+      <w:bookmarkStart w:id="5" w:name="_Toc242212715"/>
       <w:r>
         <w:rPr>
           <w:rFonts w:ascii="Times New Roman" w:eastAsia="Arial" w:hAnsi="Times New Roman"/>
@@ -3593,7 +3593,7 @@
         <w:pStyle w:val="1"/>
         <w:spacing w:before="280" w:after="120"/>
       </w:pPr>
-      <w:bookmarkStart w:id="6" w:name="_Toc242208234"/>
+      <w:bookmarkStart w:id="6" w:name="_Toc242212716"/>
       <w:r>
         <w:rPr>
           <w:rFonts w:ascii="Times New Roman" w:eastAsia="Arial" w:hAnsi="Times New Roman"/>
@@ -3799,7 +3799,7 @@
         <w:pStyle w:val="1"/>
         <w:spacing w:before="280" w:after="120"/>
       </w:pPr>
-      <w:bookmarkStart w:id="7" w:name="_Toc242208235"/>
+      <w:bookmarkStart w:id="7" w:name="_Toc242212717"/>
       <w:r>
         <w:rPr>
           <w:rFonts w:ascii="Times New Roman" w:eastAsia="Arial" w:hAnsi="Times New Roman"/>
@@ -3943,7 +3943,7 @@
         <w:pStyle w:val="1"/>
         <w:spacing w:before="280" w:after="120"/>
       </w:pPr>
-      <w:bookmarkStart w:id="8" w:name="_Toc242208236"/>
+      <w:bookmarkStart w:id="8" w:name="_Toc242212718"/>
       <w:r>
         <w:rPr>
           <w:rFonts w:ascii="Times New Roman" w:eastAsia="Arial" w:hAnsi="Times New Roman"/>
@@ -4252,7 +4252,7 @@
         <w:pStyle w:val="1"/>
         <w:spacing w:before="280" w:after="120"/>
       </w:pPr>
-      <w:bookmarkStart w:id="9" w:name="_Toc242208237"/>
+      <w:bookmarkStart w:id="9" w:name="_Toc242212719"/>
       <w:r>
         <w:rPr>
           <w:rFonts w:ascii="Times New Roman" w:eastAsia="Arial" w:hAnsi="Times New Roman"/>
@@ -4348,7 +4348,7 @@
         <w:pStyle w:val="1"/>
         <w:spacing w:before="280" w:after="120"/>
       </w:pPr>
-      <w:bookmarkStart w:id="10" w:name="_Toc242208238"/>
+      <w:bookmarkStart w:id="10" w:name="_Toc242212720"/>
       <w:r>
         <w:rPr>
           <w:rFonts w:ascii="Times New Roman" w:eastAsia="Arial" w:hAnsi="Times New Roman"/>
@@ -4454,7 +4454,7 @@
         <w:pStyle w:val="1"/>
         <w:spacing w:before="280" w:after="120"/>
       </w:pPr>
-      <w:bookmarkStart w:id="11" w:name="_Toc242208239"/>
+      <w:bookmarkStart w:id="11" w:name="_Toc242212721"/>
       <w:r>
         <w:rPr>
           <w:rFonts w:ascii="Times New Roman" w:eastAsia="Arial" w:hAnsi="Times New Roman"/>
@@ -4619,7 +4619,7 @@
         <w:pStyle w:val="1"/>
         <w:spacing w:before="280" w:after="120"/>
       </w:pPr>
-      <w:bookmarkStart w:id="12" w:name="_Toc242208240"/>
+      <w:bookmarkStart w:id="12" w:name="_Toc242212722"/>
       <w:r>
         <w:rPr>
           <w:rFonts w:ascii="Times New Roman" w:eastAsia="Arial" w:hAnsi="Times New Roman"/>
@@ -4857,7 +4857,7 @@
         <w:pStyle w:val="1"/>
         <w:spacing w:before="280" w:after="120"/>
       </w:pPr>
-      <w:bookmarkStart w:id="13" w:name="_Toc242208241"/>
+      <w:bookmarkStart w:id="13" w:name="_Toc242212723"/>
       <w:r>
         <w:rPr>
           <w:rFonts w:ascii="Times New Roman" w:eastAsia="Arial" w:hAnsi="Times New Roman"/>
@@ -5616,31 +5616,31 @@
       </w:rPr>
     </w:lvl>
   </w:abstractNum>
-  <w:num w:numId="1" w16cid:durableId="445391548">
+  <w:num w:numId="1" w16cid:durableId="1242059289">
     <w:abstractNumId w:val="8"/>
   </w:num>
-  <w:num w:numId="2" w16cid:durableId="640159101">
+  <w:num w:numId="2" w16cid:durableId="1891184388">
     <w:abstractNumId w:val="6"/>
   </w:num>
-  <w:num w:numId="3" w16cid:durableId="828786945">
+  <w:num w:numId="3" w16cid:durableId="673921128">
     <w:abstractNumId w:val="5"/>
   </w:num>
-  <w:num w:numId="4" w16cid:durableId="822543364">
+  <w:num w:numId="4" w16cid:durableId="1470284">
     <w:abstractNumId w:val="4"/>
   </w:num>
-  <w:num w:numId="5" w16cid:durableId="1179348027">
+  <w:num w:numId="5" w16cid:durableId="568660394">
     <w:abstractNumId w:val="7"/>
   </w:num>
-  <w:num w:numId="6" w16cid:durableId="1933466661">
+  <w:num w:numId="6" w16cid:durableId="1916628515">
     <w:abstractNumId w:val="3"/>
   </w:num>
-  <w:num w:numId="7" w16cid:durableId="717703325">
+  <w:num w:numId="7" w16cid:durableId="587809677">
     <w:abstractNumId w:val="2"/>
   </w:num>
-  <w:num w:numId="8" w16cid:durableId="115029674">
+  <w:num w:numId="8" w16cid:durableId="657151575">
     <w:abstractNumId w:val="1"/>
   </w:num>
-  <w:num w:numId="9" w16cid:durableId="1135753254">
+  <w:num w:numId="9" w16cid:durableId="834802221">
     <w:abstractNumId w:val="0"/>
   </w:num>
 </w:numbering>
@@ -17039,14 +17039,14 @@
     <w:autoRedefine/>
     <w:uiPriority w:val="39"/>
     <w:unhideWhenUsed/>
-    <w:rsid w:val="00B61236"/>
+    <w:rsid w:val="00005226"/>
   </w:style>
   <w:style w:type="character" w:styleId="aff9">
     <w:name w:val="Hyperlink"/>
     <w:basedOn w:val="a2"/>
     <w:uiPriority w:val="99"/>
     <w:unhideWhenUsed/>
-    <w:rsid w:val="00B61236"/>
+    <w:rsid w:val="00005226"/>
     <w:rPr>
       <w:color w:val="0000FF" w:themeColor="hyperlink"/>
       <w:u w:val="single"/>

</xml_diff>

<commit_message>
Record how the CICC gap was verified and restore the unmatchable marker
A search for 中金公司 across the seven annual extracts returns 237 rows, all of them with
stock code 601995.SH, so they are reports about the stock CICC rather than by the broker.
The firm stays marked as unmatchable, now with the evidence in the comment, and the two
documents state the check.

Co-Authored-By: Claude Fable 5.1 <noreply@anthropic.com>
</commit_message>
<xml_diff>
--- a/Project10_Star_Analyst_Research_Plan_EN.docx
+++ b/Project10_Star_Analyst_Research_Plan_EN.docx
@@ -202,7 +202,7 @@
         </w:rPr>
         <w:fldChar w:fldCharType="separate"/>
       </w:r>
-      <w:hyperlink w:anchor="_Toc242212710" w:history="1">
+      <w:hyperlink w:anchor="_Toc242214365" w:history="1">
         <w:r>
           <w:rPr>
             <w:rStyle w:val="aff9"/>
@@ -240,7 +240,7 @@
             <w:noProof/>
             <w:webHidden/>
           </w:rPr>
-          <w:instrText>PAGEREF _Toc242212710 \h</w:instrText>
+          <w:instrText>PAGEREF _Toc242214365 \h</w:instrText>
         </w:r>
         <w:r>
           <w:rPr>
@@ -298,7 +298,7 @@
           <w14:ligatures w14:val="standardContextual"/>
         </w:rPr>
       </w:pPr>
-      <w:hyperlink w:anchor="_Toc242212711" w:history="1">
+      <w:hyperlink w:anchor="_Toc242214366" w:history="1">
         <w:r>
           <w:rPr>
             <w:rStyle w:val="aff9"/>
@@ -336,7 +336,7 @@
             <w:noProof/>
             <w:webHidden/>
           </w:rPr>
-          <w:instrText>PAGEREF _Toc242212711 \h</w:instrText>
+          <w:instrText>PAGEREF _Toc242214366 \h</w:instrText>
         </w:r>
         <w:r>
           <w:rPr>
@@ -394,7 +394,7 @@
           <w14:ligatures w14:val="standardContextual"/>
         </w:rPr>
       </w:pPr>
-      <w:hyperlink w:anchor="_Toc242212712" w:history="1">
+      <w:hyperlink w:anchor="_Toc242214367" w:history="1">
         <w:r>
           <w:rPr>
             <w:rStyle w:val="aff9"/>
@@ -432,7 +432,7 @@
             <w:noProof/>
             <w:webHidden/>
           </w:rPr>
-          <w:instrText>PAGEREF _Toc242212712 \h</w:instrText>
+          <w:instrText>PAGEREF _Toc242214367 \h</w:instrText>
         </w:r>
         <w:r>
           <w:rPr>
@@ -490,7 +490,7 @@
           <w14:ligatures w14:val="standardContextual"/>
         </w:rPr>
       </w:pPr>
-      <w:hyperlink w:anchor="_Toc242212713" w:history="1">
+      <w:hyperlink w:anchor="_Toc242214368" w:history="1">
         <w:r>
           <w:rPr>
             <w:rStyle w:val="aff9"/>
@@ -528,7 +528,7 @@
             <w:noProof/>
             <w:webHidden/>
           </w:rPr>
-          <w:instrText>PAGEREF _Toc242212713 \h</w:instrText>
+          <w:instrText>PAGEREF _Toc242214368 \h</w:instrText>
         </w:r>
         <w:r>
           <w:rPr>
@@ -586,7 +586,7 @@
           <w14:ligatures w14:val="standardContextual"/>
         </w:rPr>
       </w:pPr>
-      <w:hyperlink w:anchor="_Toc242212714" w:history="1">
+      <w:hyperlink w:anchor="_Toc242214369" w:history="1">
         <w:r>
           <w:rPr>
             <w:rStyle w:val="aff9"/>
@@ -624,7 +624,7 @@
             <w:noProof/>
             <w:webHidden/>
           </w:rPr>
-          <w:instrText>PAGEREF _Toc242212714 \h</w:instrText>
+          <w:instrText>PAGEREF _Toc242214369 \h</w:instrText>
         </w:r>
         <w:r>
           <w:rPr>
@@ -682,7 +682,7 @@
           <w14:ligatures w14:val="standardContextual"/>
         </w:rPr>
       </w:pPr>
-      <w:hyperlink w:anchor="_Toc242212715" w:history="1">
+      <w:hyperlink w:anchor="_Toc242214370" w:history="1">
         <w:r>
           <w:rPr>
             <w:rStyle w:val="aff9"/>
@@ -720,7 +720,7 @@
             <w:noProof/>
             <w:webHidden/>
           </w:rPr>
-          <w:instrText>PAGEREF _Toc242212715 \h</w:instrText>
+          <w:instrText>PAGEREF _Toc242214370 \h</w:instrText>
         </w:r>
         <w:r>
           <w:rPr>
@@ -778,7 +778,7 @@
           <w14:ligatures w14:val="standardContextual"/>
         </w:rPr>
       </w:pPr>
-      <w:hyperlink w:anchor="_Toc242212716" w:history="1">
+      <w:hyperlink w:anchor="_Toc242214371" w:history="1">
         <w:r>
           <w:rPr>
             <w:rStyle w:val="aff9"/>
@@ -816,7 +816,7 @@
             <w:noProof/>
             <w:webHidden/>
           </w:rPr>
-          <w:instrText>PAGEREF _Toc242212716 \h</w:instrText>
+          <w:instrText>PAGEREF _Toc242214371 \h</w:instrText>
         </w:r>
         <w:r>
           <w:rPr>
@@ -874,7 +874,7 @@
           <w14:ligatures w14:val="standardContextual"/>
         </w:rPr>
       </w:pPr>
-      <w:hyperlink w:anchor="_Toc242212717" w:history="1">
+      <w:hyperlink w:anchor="_Toc242214372" w:history="1">
         <w:r>
           <w:rPr>
             <w:rStyle w:val="aff9"/>
@@ -912,7 +912,7 @@
             <w:noProof/>
             <w:webHidden/>
           </w:rPr>
-          <w:instrText>PAGEREF _Toc242212717 \h</w:instrText>
+          <w:instrText>PAGEREF _Toc242214372 \h</w:instrText>
         </w:r>
         <w:r>
           <w:rPr>
@@ -970,7 +970,7 @@
           <w14:ligatures w14:val="standardContextual"/>
         </w:rPr>
       </w:pPr>
-      <w:hyperlink w:anchor="_Toc242212718" w:history="1">
+      <w:hyperlink w:anchor="_Toc242214373" w:history="1">
         <w:r>
           <w:rPr>
             <w:rStyle w:val="aff9"/>
@@ -1008,7 +1008,7 @@
             <w:noProof/>
             <w:webHidden/>
           </w:rPr>
-          <w:instrText>PAGEREF _Toc242212718 \h</w:instrText>
+          <w:instrText>PAGEREF _Toc242214373 \h</w:instrText>
         </w:r>
         <w:r>
           <w:rPr>
@@ -1066,7 +1066,7 @@
           <w14:ligatures w14:val="standardContextual"/>
         </w:rPr>
       </w:pPr>
-      <w:hyperlink w:anchor="_Toc242212719" w:history="1">
+      <w:hyperlink w:anchor="_Toc242214374" w:history="1">
         <w:r>
           <w:rPr>
             <w:rStyle w:val="aff9"/>
@@ -1104,7 +1104,7 @@
             <w:noProof/>
             <w:webHidden/>
           </w:rPr>
-          <w:instrText>PAGEREF _Toc242212719 \h</w:instrText>
+          <w:instrText>PAGEREF _Toc242214374 \h</w:instrText>
         </w:r>
         <w:r>
           <w:rPr>
@@ -1162,7 +1162,7 @@
           <w14:ligatures w14:val="standardContextual"/>
         </w:rPr>
       </w:pPr>
-      <w:hyperlink w:anchor="_Toc242212720" w:history="1">
+      <w:hyperlink w:anchor="_Toc242214375" w:history="1">
         <w:r>
           <w:rPr>
             <w:rStyle w:val="aff9"/>
@@ -1200,7 +1200,7 @@
             <w:noProof/>
             <w:webHidden/>
           </w:rPr>
-          <w:instrText>PAGEREF _Toc242212720 \h</w:instrText>
+          <w:instrText>PAGEREF _Toc242214375 \h</w:instrText>
         </w:r>
         <w:r>
           <w:rPr>
@@ -1258,7 +1258,7 @@
           <w14:ligatures w14:val="standardContextual"/>
         </w:rPr>
       </w:pPr>
-      <w:hyperlink w:anchor="_Toc242212721" w:history="1">
+      <w:hyperlink w:anchor="_Toc242214376" w:history="1">
         <w:r>
           <w:rPr>
             <w:rStyle w:val="aff9"/>
@@ -1296,7 +1296,7 @@
             <w:noProof/>
             <w:webHidden/>
           </w:rPr>
-          <w:instrText>PAGEREF _Toc242212721 \h</w:instrText>
+          <w:instrText>PAGEREF _Toc242214376 \h</w:instrText>
         </w:r>
         <w:r>
           <w:rPr>
@@ -1354,7 +1354,7 @@
           <w14:ligatures w14:val="standardContextual"/>
         </w:rPr>
       </w:pPr>
-      <w:hyperlink w:anchor="_Toc242212722" w:history="1">
+      <w:hyperlink w:anchor="_Toc242214377" w:history="1">
         <w:r>
           <w:rPr>
             <w:rStyle w:val="aff9"/>
@@ -1392,7 +1392,7 @@
             <w:noProof/>
             <w:webHidden/>
           </w:rPr>
-          <w:instrText>PAGEREF _Toc242212722 \h</w:instrText>
+          <w:instrText>PAGEREF _Toc242214377 \h</w:instrText>
         </w:r>
         <w:r>
           <w:rPr>
@@ -1450,7 +1450,7 @@
           <w14:ligatures w14:val="standardContextual"/>
         </w:rPr>
       </w:pPr>
-      <w:hyperlink w:anchor="_Toc242212723" w:history="1">
+      <w:hyperlink w:anchor="_Toc242214378" w:history="1">
         <w:r>
           <w:rPr>
             <w:rStyle w:val="aff9"/>
@@ -1488,7 +1488,7 @@
             <w:noProof/>
             <w:webHidden/>
           </w:rPr>
-          <w:instrText>PAGEREF _Toc242212723 \h</w:instrText>
+          <w:instrText>PAGEREF _Toc242214378 \h</w:instrText>
         </w:r>
         <w:r>
           <w:rPr>
@@ -1543,7 +1543,7 @@
         <w:pStyle w:val="1"/>
         <w:spacing w:before="280" w:after="120"/>
       </w:pPr>
-      <w:bookmarkStart w:id="0" w:name="_Toc242212710"/>
+      <w:bookmarkStart w:id="0" w:name="_Toc242214365"/>
       <w:r>
         <w:rPr>
           <w:rFonts w:ascii="Times New Roman" w:eastAsia="Arial" w:hAnsi="Times New Roman"/>
@@ -1992,7 +1992,7 @@
         <w:pStyle w:val="1"/>
         <w:spacing w:before="280" w:after="120"/>
       </w:pPr>
-      <w:bookmarkStart w:id="1" w:name="_Toc242212711"/>
+      <w:bookmarkStart w:id="1" w:name="_Toc242214366"/>
       <w:r>
         <w:rPr>
           <w:rFonts w:ascii="Times New Roman" w:eastAsia="Arial" w:hAnsi="Times New Roman"/>
@@ -2040,7 +2040,7 @@
         <w:pStyle w:val="1"/>
         <w:spacing w:before="280" w:after="120"/>
       </w:pPr>
-      <w:bookmarkStart w:id="2" w:name="_Toc242212712"/>
+      <w:bookmarkStart w:id="2" w:name="_Toc242214367"/>
       <w:r>
         <w:rPr>
           <w:rFonts w:ascii="Times New Roman" w:eastAsia="Arial" w:hAnsi="Times New Roman"/>
@@ -2460,7 +2460,7 @@
         <w:pStyle w:val="1"/>
         <w:spacing w:before="280" w:after="120"/>
       </w:pPr>
-      <w:bookmarkStart w:id="3" w:name="_Toc242212713"/>
+      <w:bookmarkStart w:id="3" w:name="_Toc242214368"/>
       <w:r>
         <w:rPr>
           <w:rFonts w:ascii="Times New Roman" w:eastAsia="Arial" w:hAnsi="Times New Roman"/>
@@ -2967,7 +2967,7 @@
         <w:pStyle w:val="1"/>
         <w:spacing w:before="280" w:after="120"/>
       </w:pPr>
-      <w:bookmarkStart w:id="4" w:name="_Toc242212714"/>
+      <w:bookmarkStart w:id="4" w:name="_Toc242214369"/>
       <w:r>
         <w:rPr>
           <w:rFonts w:ascii="Times New Roman" w:eastAsia="Arial" w:hAnsi="Times New Roman"/>
@@ -3421,7 +3421,7 @@
         <w:pStyle w:val="1"/>
         <w:spacing w:before="280" w:after="120"/>
       </w:pPr>
-      <w:bookmarkStart w:id="5" w:name="_Toc242212715"/>
+      <w:bookmarkStart w:id="5" w:name="_Toc242214370"/>
       <w:r>
         <w:rPr>
           <w:rFonts w:ascii="Times New Roman" w:eastAsia="Arial" w:hAnsi="Times New Roman"/>
@@ -3593,7 +3593,7 @@
         <w:pStyle w:val="1"/>
         <w:spacing w:before="280" w:after="120"/>
       </w:pPr>
-      <w:bookmarkStart w:id="6" w:name="_Toc242212716"/>
+      <w:bookmarkStart w:id="6" w:name="_Toc242214371"/>
       <w:r>
         <w:rPr>
           <w:rFonts w:ascii="Times New Roman" w:eastAsia="Arial" w:hAnsi="Times New Roman"/>
@@ -3799,7 +3799,7 @@
         <w:pStyle w:val="1"/>
         <w:spacing w:before="280" w:after="120"/>
       </w:pPr>
-      <w:bookmarkStart w:id="7" w:name="_Toc242212717"/>
+      <w:bookmarkStart w:id="7" w:name="_Toc242214372"/>
       <w:r>
         <w:rPr>
           <w:rFonts w:ascii="Times New Roman" w:eastAsia="Arial" w:hAnsi="Times New Roman"/>
@@ -3943,7 +3943,7 @@
         <w:pStyle w:val="1"/>
         <w:spacing w:before="280" w:after="120"/>
       </w:pPr>
-      <w:bookmarkStart w:id="8" w:name="_Toc242212718"/>
+      <w:bookmarkStart w:id="8" w:name="_Toc242214373"/>
       <w:r>
         <w:rPr>
           <w:rFonts w:ascii="Times New Roman" w:eastAsia="Arial" w:hAnsi="Times New Roman"/>
@@ -4252,7 +4252,7 @@
         <w:pStyle w:val="1"/>
         <w:spacing w:before="280" w:after="120"/>
       </w:pPr>
-      <w:bookmarkStart w:id="9" w:name="_Toc242212719"/>
+      <w:bookmarkStart w:id="9" w:name="_Toc242214374"/>
       <w:r>
         <w:rPr>
           <w:rFonts w:ascii="Times New Roman" w:eastAsia="Arial" w:hAnsi="Times New Roman"/>
@@ -4348,7 +4348,7 @@
         <w:pStyle w:val="1"/>
         <w:spacing w:before="280" w:after="120"/>
       </w:pPr>
-      <w:bookmarkStart w:id="10" w:name="_Toc242212720"/>
+      <w:bookmarkStart w:id="10" w:name="_Toc242214375"/>
       <w:r>
         <w:rPr>
           <w:rFonts w:ascii="Times New Roman" w:eastAsia="Arial" w:hAnsi="Times New Roman"/>
@@ -4454,7 +4454,7 @@
         <w:pStyle w:val="1"/>
         <w:spacing w:before="280" w:after="120"/>
       </w:pPr>
-      <w:bookmarkStart w:id="11" w:name="_Toc242212721"/>
+      <w:bookmarkStart w:id="11" w:name="_Toc242214376"/>
       <w:r>
         <w:rPr>
           <w:rFonts w:ascii="Times New Roman" w:eastAsia="Arial" w:hAnsi="Times New Roman"/>
@@ -4619,7 +4619,7 @@
         <w:pStyle w:val="1"/>
         <w:spacing w:before="280" w:after="120"/>
       </w:pPr>
-      <w:bookmarkStart w:id="12" w:name="_Toc242212722"/>
+      <w:bookmarkStart w:id="12" w:name="_Toc242214377"/>
       <w:r>
         <w:rPr>
           <w:rFonts w:ascii="Times New Roman" w:eastAsia="Arial" w:hAnsi="Times New Roman"/>
@@ -4857,7 +4857,7 @@
         <w:pStyle w:val="1"/>
         <w:spacing w:before="280" w:after="120"/>
       </w:pPr>
-      <w:bookmarkStart w:id="13" w:name="_Toc242212723"/>
+      <w:bookmarkStart w:id="13" w:name="_Toc242214378"/>
       <w:r>
         <w:rPr>
           <w:rFonts w:ascii="Times New Roman" w:eastAsia="Arial" w:hAnsi="Times New Roman"/>
@@ -4917,7 +4917,27 @@
         <w:rPr>
           <w:color w:val="000000"/>
         </w:rPr>
-        <w:t>never be matched.</w:t>
+        <w:t xml:space="preserve">never be matched. The 237 hits for </w:t>
+      </w:r>
+      <w:r>
+        <w:rPr>
+          <w:color w:val="000000"/>
+        </w:rPr>
+        <w:t>中金公司</w:t>
+      </w:r>
+      <w:r>
+        <w:rPr>
+          <w:color w:val="000000"/>
+        </w:rPr>
+        <w:t xml:space="preserve"> across the extracts are all the stock</w:t>
+      </w:r>
+    </w:p>
+    <w:p>
+      <w:r>
+        <w:rPr>
+          <w:color w:val="000000"/>
+        </w:rPr>
+        <w:t>601995.SH, not the broker.</w:t>
       </w:r>
     </w:p>
     <w:p>
@@ -4943,6 +4963,7 @@
           <w:color w:val="000000"/>
           <w:sz w:val="22"/>
         </w:rPr>
+        <w:lastRenderedPageBreak/>
         <w:t>资历</w:t>
       </w:r>
       <w:r>
@@ -4965,7 +4986,6 @@
         <w:rPr>
           <w:color w:val="000000"/>
         </w:rPr>
-        <w:lastRenderedPageBreak/>
         <w:t>against one another, and December 2012 is absent from the source. Neither gap can be</w:t>
       </w:r>
     </w:p>
@@ -5616,31 +5636,31 @@
       </w:rPr>
     </w:lvl>
   </w:abstractNum>
-  <w:num w:numId="1" w16cid:durableId="1242059289">
+  <w:num w:numId="1" w16cid:durableId="1473791718">
     <w:abstractNumId w:val="8"/>
   </w:num>
-  <w:num w:numId="2" w16cid:durableId="1891184388">
+  <w:num w:numId="2" w16cid:durableId="984703684">
     <w:abstractNumId w:val="6"/>
   </w:num>
-  <w:num w:numId="3" w16cid:durableId="673921128">
+  <w:num w:numId="3" w16cid:durableId="466825338">
     <w:abstractNumId w:val="5"/>
   </w:num>
-  <w:num w:numId="4" w16cid:durableId="1470284">
+  <w:num w:numId="4" w16cid:durableId="2070347951">
     <w:abstractNumId w:val="4"/>
   </w:num>
-  <w:num w:numId="5" w16cid:durableId="568660394">
+  <w:num w:numId="5" w16cid:durableId="506402652">
     <w:abstractNumId w:val="7"/>
   </w:num>
-  <w:num w:numId="6" w16cid:durableId="1916628515">
+  <w:num w:numId="6" w16cid:durableId="1958247420">
     <w:abstractNumId w:val="3"/>
   </w:num>
-  <w:num w:numId="7" w16cid:durableId="587809677">
+  <w:num w:numId="7" w16cid:durableId="1321890443">
     <w:abstractNumId w:val="2"/>
   </w:num>
-  <w:num w:numId="8" w16cid:durableId="657151575">
+  <w:num w:numId="8" w16cid:durableId="1971938371">
     <w:abstractNumId w:val="1"/>
   </w:num>
-  <w:num w:numId="9" w16cid:durableId="834802221">
+  <w:num w:numId="9" w16cid:durableId="1013219151">
     <w:abstractNumId w:val="0"/>
   </w:num>
 </w:numbering>
@@ -17039,14 +17059,14 @@
     <w:autoRedefine/>
     <w:uiPriority w:val="39"/>
     <w:unhideWhenUsed/>
-    <w:rsid w:val="00005226"/>
+    <w:rsid w:val="00FA63EF"/>
   </w:style>
   <w:style w:type="character" w:styleId="aff9">
     <w:name w:val="Hyperlink"/>
     <w:basedOn w:val="a2"/>
     <w:uiPriority w:val="99"/>
     <w:unhideWhenUsed/>
-    <w:rsid w:val="00005226"/>
+    <w:rsid w:val="00FA63EF"/>
     <w:rPr>
       <w:color w:val="0000FF" w:themeColor="hyperlink"/>
       <w:u w:val="single"/>

</xml_diff>

<commit_message>
Note that CICC's ranked teams are all fixed income, so they file no stock recommendations
Co-Authored-By: Claude Fable 5.1 <noreply@anthropic.com>
</commit_message>
<xml_diff>
--- a/Project10_Star_Analyst_Research_Plan_EN.docx
+++ b/Project10_Star_Analyst_Research_Plan_EN.docx
@@ -202,7 +202,7 @@
         </w:rPr>
         <w:fldChar w:fldCharType="separate"/>
       </w:r>
-      <w:hyperlink w:anchor="_Toc242214365" w:history="1">
+      <w:hyperlink w:anchor="_Toc242216335" w:history="1">
         <w:r>
           <w:rPr>
             <w:rStyle w:val="aff9"/>
@@ -240,7 +240,7 @@
             <w:noProof/>
             <w:webHidden/>
           </w:rPr>
-          <w:instrText>PAGEREF _Toc242214365 \h</w:instrText>
+          <w:instrText>PAGEREF _Toc242216335 \h</w:instrText>
         </w:r>
         <w:r>
           <w:rPr>
@@ -298,7 +298,7 @@
           <w14:ligatures w14:val="standardContextual"/>
         </w:rPr>
       </w:pPr>
-      <w:hyperlink w:anchor="_Toc242214366" w:history="1">
+      <w:hyperlink w:anchor="_Toc242216336" w:history="1">
         <w:r>
           <w:rPr>
             <w:rStyle w:val="aff9"/>
@@ -336,7 +336,7 @@
             <w:noProof/>
             <w:webHidden/>
           </w:rPr>
-          <w:instrText>PAGEREF _Toc242214366 \h</w:instrText>
+          <w:instrText>PAGEREF _Toc242216336 \h</w:instrText>
         </w:r>
         <w:r>
           <w:rPr>
@@ -394,7 +394,7 @@
           <w14:ligatures w14:val="standardContextual"/>
         </w:rPr>
       </w:pPr>
-      <w:hyperlink w:anchor="_Toc242214367" w:history="1">
+      <w:hyperlink w:anchor="_Toc242216337" w:history="1">
         <w:r>
           <w:rPr>
             <w:rStyle w:val="aff9"/>
@@ -432,7 +432,7 @@
             <w:noProof/>
             <w:webHidden/>
           </w:rPr>
-          <w:instrText>PAGEREF _Toc242214367 \h</w:instrText>
+          <w:instrText>PAGEREF _Toc242216337 \h</w:instrText>
         </w:r>
         <w:r>
           <w:rPr>
@@ -490,7 +490,7 @@
           <w14:ligatures w14:val="standardContextual"/>
         </w:rPr>
       </w:pPr>
-      <w:hyperlink w:anchor="_Toc242214368" w:history="1">
+      <w:hyperlink w:anchor="_Toc242216338" w:history="1">
         <w:r>
           <w:rPr>
             <w:rStyle w:val="aff9"/>
@@ -528,7 +528,7 @@
             <w:noProof/>
             <w:webHidden/>
           </w:rPr>
-          <w:instrText>PAGEREF _Toc242214368 \h</w:instrText>
+          <w:instrText>PAGEREF _Toc242216338 \h</w:instrText>
         </w:r>
         <w:r>
           <w:rPr>
@@ -586,7 +586,7 @@
           <w14:ligatures w14:val="standardContextual"/>
         </w:rPr>
       </w:pPr>
-      <w:hyperlink w:anchor="_Toc242214369" w:history="1">
+      <w:hyperlink w:anchor="_Toc242216339" w:history="1">
         <w:r>
           <w:rPr>
             <w:rStyle w:val="aff9"/>
@@ -624,7 +624,7 @@
             <w:noProof/>
             <w:webHidden/>
           </w:rPr>
-          <w:instrText>PAGEREF _Toc242214369 \h</w:instrText>
+          <w:instrText>PAGEREF _Toc242216339 \h</w:instrText>
         </w:r>
         <w:r>
           <w:rPr>
@@ -682,7 +682,7 @@
           <w14:ligatures w14:val="standardContextual"/>
         </w:rPr>
       </w:pPr>
-      <w:hyperlink w:anchor="_Toc242214370" w:history="1">
+      <w:hyperlink w:anchor="_Toc242216340" w:history="1">
         <w:r>
           <w:rPr>
             <w:rStyle w:val="aff9"/>
@@ -720,7 +720,7 @@
             <w:noProof/>
             <w:webHidden/>
           </w:rPr>
-          <w:instrText>PAGEREF _Toc242214370 \h</w:instrText>
+          <w:instrText>PAGEREF _Toc242216340 \h</w:instrText>
         </w:r>
         <w:r>
           <w:rPr>
@@ -778,7 +778,7 @@
           <w14:ligatures w14:val="standardContextual"/>
         </w:rPr>
       </w:pPr>
-      <w:hyperlink w:anchor="_Toc242214371" w:history="1">
+      <w:hyperlink w:anchor="_Toc242216341" w:history="1">
         <w:r>
           <w:rPr>
             <w:rStyle w:val="aff9"/>
@@ -816,7 +816,7 @@
             <w:noProof/>
             <w:webHidden/>
           </w:rPr>
-          <w:instrText>PAGEREF _Toc242214371 \h</w:instrText>
+          <w:instrText>PAGEREF _Toc242216341 \h</w:instrText>
         </w:r>
         <w:r>
           <w:rPr>
@@ -874,7 +874,7 @@
           <w14:ligatures w14:val="standardContextual"/>
         </w:rPr>
       </w:pPr>
-      <w:hyperlink w:anchor="_Toc242214372" w:history="1">
+      <w:hyperlink w:anchor="_Toc242216342" w:history="1">
         <w:r>
           <w:rPr>
             <w:rStyle w:val="aff9"/>
@@ -912,7 +912,7 @@
             <w:noProof/>
             <w:webHidden/>
           </w:rPr>
-          <w:instrText>PAGEREF _Toc242214372 \h</w:instrText>
+          <w:instrText>PAGEREF _Toc242216342 \h</w:instrText>
         </w:r>
         <w:r>
           <w:rPr>
@@ -970,7 +970,7 @@
           <w14:ligatures w14:val="standardContextual"/>
         </w:rPr>
       </w:pPr>
-      <w:hyperlink w:anchor="_Toc242214373" w:history="1">
+      <w:hyperlink w:anchor="_Toc242216343" w:history="1">
         <w:r>
           <w:rPr>
             <w:rStyle w:val="aff9"/>
@@ -1008,7 +1008,7 @@
             <w:noProof/>
             <w:webHidden/>
           </w:rPr>
-          <w:instrText>PAGEREF _Toc242214373 \h</w:instrText>
+          <w:instrText>PAGEREF _Toc242216343 \h</w:instrText>
         </w:r>
         <w:r>
           <w:rPr>
@@ -1066,7 +1066,7 @@
           <w14:ligatures w14:val="standardContextual"/>
         </w:rPr>
       </w:pPr>
-      <w:hyperlink w:anchor="_Toc242214374" w:history="1">
+      <w:hyperlink w:anchor="_Toc242216344" w:history="1">
         <w:r>
           <w:rPr>
             <w:rStyle w:val="aff9"/>
@@ -1104,7 +1104,7 @@
             <w:noProof/>
             <w:webHidden/>
           </w:rPr>
-          <w:instrText>PAGEREF _Toc242214374 \h</w:instrText>
+          <w:instrText>PAGEREF _Toc242216344 \h</w:instrText>
         </w:r>
         <w:r>
           <w:rPr>
@@ -1162,7 +1162,7 @@
           <w14:ligatures w14:val="standardContextual"/>
         </w:rPr>
       </w:pPr>
-      <w:hyperlink w:anchor="_Toc242214375" w:history="1">
+      <w:hyperlink w:anchor="_Toc242216345" w:history="1">
         <w:r>
           <w:rPr>
             <w:rStyle w:val="aff9"/>
@@ -1200,7 +1200,7 @@
             <w:noProof/>
             <w:webHidden/>
           </w:rPr>
-          <w:instrText>PAGEREF _Toc242214375 \h</w:instrText>
+          <w:instrText>PAGEREF _Toc242216345 \h</w:instrText>
         </w:r>
         <w:r>
           <w:rPr>
@@ -1258,7 +1258,7 @@
           <w14:ligatures w14:val="standardContextual"/>
         </w:rPr>
       </w:pPr>
-      <w:hyperlink w:anchor="_Toc242214376" w:history="1">
+      <w:hyperlink w:anchor="_Toc242216346" w:history="1">
         <w:r>
           <w:rPr>
             <w:rStyle w:val="aff9"/>
@@ -1296,7 +1296,7 @@
             <w:noProof/>
             <w:webHidden/>
           </w:rPr>
-          <w:instrText>PAGEREF _Toc242214376 \h</w:instrText>
+          <w:instrText>PAGEREF _Toc242216346 \h</w:instrText>
         </w:r>
         <w:r>
           <w:rPr>
@@ -1354,7 +1354,7 @@
           <w14:ligatures w14:val="standardContextual"/>
         </w:rPr>
       </w:pPr>
-      <w:hyperlink w:anchor="_Toc242214377" w:history="1">
+      <w:hyperlink w:anchor="_Toc242216347" w:history="1">
         <w:r>
           <w:rPr>
             <w:rStyle w:val="aff9"/>
@@ -1392,7 +1392,7 @@
             <w:noProof/>
             <w:webHidden/>
           </w:rPr>
-          <w:instrText>PAGEREF _Toc242214377 \h</w:instrText>
+          <w:instrText>PAGEREF _Toc242216347 \h</w:instrText>
         </w:r>
         <w:r>
           <w:rPr>
@@ -1450,7 +1450,7 @@
           <w14:ligatures w14:val="standardContextual"/>
         </w:rPr>
       </w:pPr>
-      <w:hyperlink w:anchor="_Toc242214378" w:history="1">
+      <w:hyperlink w:anchor="_Toc242216348" w:history="1">
         <w:r>
           <w:rPr>
             <w:rStyle w:val="aff9"/>
@@ -1488,7 +1488,7 @@
             <w:noProof/>
             <w:webHidden/>
           </w:rPr>
-          <w:instrText>PAGEREF _Toc242214378 \h</w:instrText>
+          <w:instrText>PAGEREF _Toc242216348 \h</w:instrText>
         </w:r>
         <w:r>
           <w:rPr>
@@ -1543,7 +1543,7 @@
         <w:pStyle w:val="1"/>
         <w:spacing w:before="280" w:after="120"/>
       </w:pPr>
-      <w:bookmarkStart w:id="0" w:name="_Toc242214365"/>
+      <w:bookmarkStart w:id="0" w:name="_Toc242216335"/>
       <w:r>
         <w:rPr>
           <w:rFonts w:ascii="Times New Roman" w:eastAsia="Arial" w:hAnsi="Times New Roman"/>
@@ -1992,7 +1992,7 @@
         <w:pStyle w:val="1"/>
         <w:spacing w:before="280" w:after="120"/>
       </w:pPr>
-      <w:bookmarkStart w:id="1" w:name="_Toc242214366"/>
+      <w:bookmarkStart w:id="1" w:name="_Toc242216336"/>
       <w:r>
         <w:rPr>
           <w:rFonts w:ascii="Times New Roman" w:eastAsia="Arial" w:hAnsi="Times New Roman"/>
@@ -2040,7 +2040,7 @@
         <w:pStyle w:val="1"/>
         <w:spacing w:before="280" w:after="120"/>
       </w:pPr>
-      <w:bookmarkStart w:id="2" w:name="_Toc242214367"/>
+      <w:bookmarkStart w:id="2" w:name="_Toc242216337"/>
       <w:r>
         <w:rPr>
           <w:rFonts w:ascii="Times New Roman" w:eastAsia="Arial" w:hAnsi="Times New Roman"/>
@@ -2460,7 +2460,7 @@
         <w:pStyle w:val="1"/>
         <w:spacing w:before="280" w:after="120"/>
       </w:pPr>
-      <w:bookmarkStart w:id="3" w:name="_Toc242214368"/>
+      <w:bookmarkStart w:id="3" w:name="_Toc242216338"/>
       <w:r>
         <w:rPr>
           <w:rFonts w:ascii="Times New Roman" w:eastAsia="Arial" w:hAnsi="Times New Roman"/>
@@ -2967,7 +2967,7 @@
         <w:pStyle w:val="1"/>
         <w:spacing w:before="280" w:after="120"/>
       </w:pPr>
-      <w:bookmarkStart w:id="4" w:name="_Toc242214369"/>
+      <w:bookmarkStart w:id="4" w:name="_Toc242216339"/>
       <w:r>
         <w:rPr>
           <w:rFonts w:ascii="Times New Roman" w:eastAsia="Arial" w:hAnsi="Times New Roman"/>
@@ -3421,7 +3421,7 @@
         <w:pStyle w:val="1"/>
         <w:spacing w:before="280" w:after="120"/>
       </w:pPr>
-      <w:bookmarkStart w:id="5" w:name="_Toc242214370"/>
+      <w:bookmarkStart w:id="5" w:name="_Toc242216340"/>
       <w:r>
         <w:rPr>
           <w:rFonts w:ascii="Times New Roman" w:eastAsia="Arial" w:hAnsi="Times New Roman"/>
@@ -3593,7 +3593,7 @@
         <w:pStyle w:val="1"/>
         <w:spacing w:before="280" w:after="120"/>
       </w:pPr>
-      <w:bookmarkStart w:id="6" w:name="_Toc242214371"/>
+      <w:bookmarkStart w:id="6" w:name="_Toc242216341"/>
       <w:r>
         <w:rPr>
           <w:rFonts w:ascii="Times New Roman" w:eastAsia="Arial" w:hAnsi="Times New Roman"/>
@@ -3799,7 +3799,7 @@
         <w:pStyle w:val="1"/>
         <w:spacing w:before="280" w:after="120"/>
       </w:pPr>
-      <w:bookmarkStart w:id="7" w:name="_Toc242214372"/>
+      <w:bookmarkStart w:id="7" w:name="_Toc242216342"/>
       <w:r>
         <w:rPr>
           <w:rFonts w:ascii="Times New Roman" w:eastAsia="Arial" w:hAnsi="Times New Roman"/>
@@ -3943,7 +3943,7 @@
         <w:pStyle w:val="1"/>
         <w:spacing w:before="280" w:after="120"/>
       </w:pPr>
-      <w:bookmarkStart w:id="8" w:name="_Toc242214373"/>
+      <w:bookmarkStart w:id="8" w:name="_Toc242216343"/>
       <w:r>
         <w:rPr>
           <w:rFonts w:ascii="Times New Roman" w:eastAsia="Arial" w:hAnsi="Times New Roman"/>
@@ -4252,7 +4252,7 @@
         <w:pStyle w:val="1"/>
         <w:spacing w:before="280" w:after="120"/>
       </w:pPr>
-      <w:bookmarkStart w:id="9" w:name="_Toc242214374"/>
+      <w:bookmarkStart w:id="9" w:name="_Toc242216344"/>
       <w:r>
         <w:rPr>
           <w:rFonts w:ascii="Times New Roman" w:eastAsia="Arial" w:hAnsi="Times New Roman"/>
@@ -4348,7 +4348,7 @@
         <w:pStyle w:val="1"/>
         <w:spacing w:before="280" w:after="120"/>
       </w:pPr>
-      <w:bookmarkStart w:id="10" w:name="_Toc242214375"/>
+      <w:bookmarkStart w:id="10" w:name="_Toc242216345"/>
       <w:r>
         <w:rPr>
           <w:rFonts w:ascii="Times New Roman" w:eastAsia="Arial" w:hAnsi="Times New Roman"/>
@@ -4454,7 +4454,7 @@
         <w:pStyle w:val="1"/>
         <w:spacing w:before="280" w:after="120"/>
       </w:pPr>
-      <w:bookmarkStart w:id="11" w:name="_Toc242214376"/>
+      <w:bookmarkStart w:id="11" w:name="_Toc242216346"/>
       <w:r>
         <w:rPr>
           <w:rFonts w:ascii="Times New Roman" w:eastAsia="Arial" w:hAnsi="Times New Roman"/>
@@ -4619,7 +4619,7 @@
         <w:pStyle w:val="1"/>
         <w:spacing w:before="280" w:after="120"/>
       </w:pPr>
-      <w:bookmarkStart w:id="12" w:name="_Toc242214377"/>
+      <w:bookmarkStart w:id="12" w:name="_Toc242216347"/>
       <w:r>
         <w:rPr>
           <w:rFonts w:ascii="Times New Roman" w:eastAsia="Arial" w:hAnsi="Times New Roman"/>
@@ -4857,7 +4857,7 @@
         <w:pStyle w:val="1"/>
         <w:spacing w:before="280" w:after="120"/>
       </w:pPr>
-      <w:bookmarkStart w:id="13" w:name="_Toc242214378"/>
+      <w:bookmarkStart w:id="13" w:name="_Toc242216348"/>
       <w:r>
         <w:rPr>
           <w:rFonts w:ascii="Times New Roman" w:eastAsia="Arial" w:hAnsi="Times New Roman"/>
@@ -4937,7 +4937,15 @@
         <w:rPr>
           <w:color w:val="000000"/>
         </w:rPr>
-        <w:t>601995.SH, not the broker.</w:t>
+        <w:t>601995.SH, not the broker. Its ranked entries are all fixed income, ranked 1st in</w:t>
+      </w:r>
+    </w:p>
+    <w:p>
+      <w:r>
+        <w:rPr>
+          <w:color w:val="000000"/>
+        </w:rPr>
+        <w:t>2017, 3rd in 2019 and 4th in 2020, and those teams file no stock recommendations.</w:t>
       </w:r>
     </w:p>
     <w:p>
@@ -4949,6 +4957,7 @@
         <w:rPr>
           <w:color w:val="000000"/>
         </w:rPr>
+        <w:lastRenderedPageBreak/>
         <w:t>The ST filter is an approximation because historical ST status is unobtainable.</w:t>
       </w:r>
     </w:p>
@@ -4963,7 +4972,6 @@
           <w:color w:val="000000"/>
           <w:sz w:val="22"/>
         </w:rPr>
-        <w:lastRenderedPageBreak/>
         <w:t>资历</w:t>
       </w:r>
       <w:r>
@@ -5636,31 +5644,31 @@
       </w:rPr>
     </w:lvl>
   </w:abstractNum>
-  <w:num w:numId="1" w16cid:durableId="1473791718">
+  <w:num w:numId="1" w16cid:durableId="964236965">
     <w:abstractNumId w:val="8"/>
   </w:num>
-  <w:num w:numId="2" w16cid:durableId="984703684">
+  <w:num w:numId="2" w16cid:durableId="181476513">
     <w:abstractNumId w:val="6"/>
   </w:num>
-  <w:num w:numId="3" w16cid:durableId="466825338">
+  <w:num w:numId="3" w16cid:durableId="1414861222">
     <w:abstractNumId w:val="5"/>
   </w:num>
-  <w:num w:numId="4" w16cid:durableId="2070347951">
+  <w:num w:numId="4" w16cid:durableId="1558010646">
     <w:abstractNumId w:val="4"/>
   </w:num>
-  <w:num w:numId="5" w16cid:durableId="506402652">
+  <w:num w:numId="5" w16cid:durableId="70978891">
     <w:abstractNumId w:val="7"/>
   </w:num>
-  <w:num w:numId="6" w16cid:durableId="1958247420">
+  <w:num w:numId="6" w16cid:durableId="853037119">
     <w:abstractNumId w:val="3"/>
   </w:num>
-  <w:num w:numId="7" w16cid:durableId="1321890443">
+  <w:num w:numId="7" w16cid:durableId="783228979">
     <w:abstractNumId w:val="2"/>
   </w:num>
-  <w:num w:numId="8" w16cid:durableId="1971938371">
+  <w:num w:numId="8" w16cid:durableId="700592055">
     <w:abstractNumId w:val="1"/>
   </w:num>
-  <w:num w:numId="9" w16cid:durableId="1013219151">
+  <w:num w:numId="9" w16cid:durableId="1763380590">
     <w:abstractNumId w:val="0"/>
   </w:num>
 </w:numbering>
@@ -17059,14 +17067,14 @@
     <w:autoRedefine/>
     <w:uiPriority w:val="39"/>
     <w:unhideWhenUsed/>
-    <w:rsid w:val="00FA63EF"/>
+    <w:rsid w:val="00DC402E"/>
   </w:style>
   <w:style w:type="character" w:styleId="aff9">
     <w:name w:val="Hyperlink"/>
     <w:basedOn w:val="a2"/>
     <w:uiPriority w:val="99"/>
     <w:unhideWhenUsed/>
-    <w:rsid w:val="00FA63EF"/>
+    <w:rsid w:val="00DC402E"/>
     <w:rPr>
       <w:color w:val="0000FF" w:themeColor="hyperlink"/>
       <w:u w:val="single"/>

</xml_diff>

<commit_message>
Say that the censored seniority is a lower bound and what that does to the coefficient
Co-Authored-By: Claude Fable 5.1 <noreply@anthropic.com>
</commit_message>
<xml_diff>
--- a/Project10_Star_Analyst_Research_Plan_EN.docx
+++ b/Project10_Star_Analyst_Research_Plan_EN.docx
@@ -202,7 +202,7 @@
         </w:rPr>
         <w:fldChar w:fldCharType="separate"/>
       </w:r>
-      <w:hyperlink w:anchor="_Toc242216335" w:history="1">
+      <w:hyperlink w:anchor="_Toc242216909" w:history="1">
         <w:r>
           <w:rPr>
             <w:rStyle w:val="aff9"/>
@@ -240,7 +240,7 @@
             <w:noProof/>
             <w:webHidden/>
           </w:rPr>
-          <w:instrText>PAGEREF _Toc242216335 \h</w:instrText>
+          <w:instrText>PAGEREF _Toc242216909 \h</w:instrText>
         </w:r>
         <w:r>
           <w:rPr>
@@ -298,7 +298,7 @@
           <w14:ligatures w14:val="standardContextual"/>
         </w:rPr>
       </w:pPr>
-      <w:hyperlink w:anchor="_Toc242216336" w:history="1">
+      <w:hyperlink w:anchor="_Toc242216910" w:history="1">
         <w:r>
           <w:rPr>
             <w:rStyle w:val="aff9"/>
@@ -336,7 +336,7 @@
             <w:noProof/>
             <w:webHidden/>
           </w:rPr>
-          <w:instrText>PAGEREF _Toc242216336 \h</w:instrText>
+          <w:instrText>PAGEREF _Toc242216910 \h</w:instrText>
         </w:r>
         <w:r>
           <w:rPr>
@@ -394,7 +394,7 @@
           <w14:ligatures w14:val="standardContextual"/>
         </w:rPr>
       </w:pPr>
-      <w:hyperlink w:anchor="_Toc242216337" w:history="1">
+      <w:hyperlink w:anchor="_Toc242216911" w:history="1">
         <w:r>
           <w:rPr>
             <w:rStyle w:val="aff9"/>
@@ -432,7 +432,7 @@
             <w:noProof/>
             <w:webHidden/>
           </w:rPr>
-          <w:instrText>PAGEREF _Toc242216337 \h</w:instrText>
+          <w:instrText>PAGEREF _Toc242216911 \h</w:instrText>
         </w:r>
         <w:r>
           <w:rPr>
@@ -490,7 +490,7 @@
           <w14:ligatures w14:val="standardContextual"/>
         </w:rPr>
       </w:pPr>
-      <w:hyperlink w:anchor="_Toc242216338" w:history="1">
+      <w:hyperlink w:anchor="_Toc242216912" w:history="1">
         <w:r>
           <w:rPr>
             <w:rStyle w:val="aff9"/>
@@ -528,7 +528,7 @@
             <w:noProof/>
             <w:webHidden/>
           </w:rPr>
-          <w:instrText>PAGEREF _Toc242216338 \h</w:instrText>
+          <w:instrText>PAGEREF _Toc242216912 \h</w:instrText>
         </w:r>
         <w:r>
           <w:rPr>
@@ -586,7 +586,7 @@
           <w14:ligatures w14:val="standardContextual"/>
         </w:rPr>
       </w:pPr>
-      <w:hyperlink w:anchor="_Toc242216339" w:history="1">
+      <w:hyperlink w:anchor="_Toc242216913" w:history="1">
         <w:r>
           <w:rPr>
             <w:rStyle w:val="aff9"/>
@@ -624,7 +624,7 @@
             <w:noProof/>
             <w:webHidden/>
           </w:rPr>
-          <w:instrText>PAGEREF _Toc242216339 \h</w:instrText>
+          <w:instrText>PAGEREF _Toc242216913 \h</w:instrText>
         </w:r>
         <w:r>
           <w:rPr>
@@ -682,7 +682,7 @@
           <w14:ligatures w14:val="standardContextual"/>
         </w:rPr>
       </w:pPr>
-      <w:hyperlink w:anchor="_Toc242216340" w:history="1">
+      <w:hyperlink w:anchor="_Toc242216914" w:history="1">
         <w:r>
           <w:rPr>
             <w:rStyle w:val="aff9"/>
@@ -720,7 +720,7 @@
             <w:noProof/>
             <w:webHidden/>
           </w:rPr>
-          <w:instrText>PAGEREF _Toc242216340 \h</w:instrText>
+          <w:instrText>PAGEREF _Toc242216914 \h</w:instrText>
         </w:r>
         <w:r>
           <w:rPr>
@@ -778,7 +778,7 @@
           <w14:ligatures w14:val="standardContextual"/>
         </w:rPr>
       </w:pPr>
-      <w:hyperlink w:anchor="_Toc242216341" w:history="1">
+      <w:hyperlink w:anchor="_Toc242216915" w:history="1">
         <w:r>
           <w:rPr>
             <w:rStyle w:val="aff9"/>
@@ -816,7 +816,7 @@
             <w:noProof/>
             <w:webHidden/>
           </w:rPr>
-          <w:instrText>PAGEREF _Toc242216341 \h</w:instrText>
+          <w:instrText>PAGEREF _Toc242216915 \h</w:instrText>
         </w:r>
         <w:r>
           <w:rPr>
@@ -874,7 +874,7 @@
           <w14:ligatures w14:val="standardContextual"/>
         </w:rPr>
       </w:pPr>
-      <w:hyperlink w:anchor="_Toc242216342" w:history="1">
+      <w:hyperlink w:anchor="_Toc242216916" w:history="1">
         <w:r>
           <w:rPr>
             <w:rStyle w:val="aff9"/>
@@ -912,7 +912,7 @@
             <w:noProof/>
             <w:webHidden/>
           </w:rPr>
-          <w:instrText>PAGEREF _Toc242216342 \h</w:instrText>
+          <w:instrText>PAGEREF _Toc242216916 \h</w:instrText>
         </w:r>
         <w:r>
           <w:rPr>
@@ -970,7 +970,7 @@
           <w14:ligatures w14:val="standardContextual"/>
         </w:rPr>
       </w:pPr>
-      <w:hyperlink w:anchor="_Toc242216343" w:history="1">
+      <w:hyperlink w:anchor="_Toc242216917" w:history="1">
         <w:r>
           <w:rPr>
             <w:rStyle w:val="aff9"/>
@@ -1008,7 +1008,7 @@
             <w:noProof/>
             <w:webHidden/>
           </w:rPr>
-          <w:instrText>PAGEREF _Toc242216343 \h</w:instrText>
+          <w:instrText>PAGEREF _Toc242216917 \h</w:instrText>
         </w:r>
         <w:r>
           <w:rPr>
@@ -1066,7 +1066,7 @@
           <w14:ligatures w14:val="standardContextual"/>
         </w:rPr>
       </w:pPr>
-      <w:hyperlink w:anchor="_Toc242216344" w:history="1">
+      <w:hyperlink w:anchor="_Toc242216918" w:history="1">
         <w:r>
           <w:rPr>
             <w:rStyle w:val="aff9"/>
@@ -1104,7 +1104,7 @@
             <w:noProof/>
             <w:webHidden/>
           </w:rPr>
-          <w:instrText>PAGEREF _Toc242216344 \h</w:instrText>
+          <w:instrText>PAGEREF _Toc242216918 \h</w:instrText>
         </w:r>
         <w:r>
           <w:rPr>
@@ -1162,7 +1162,7 @@
           <w14:ligatures w14:val="standardContextual"/>
         </w:rPr>
       </w:pPr>
-      <w:hyperlink w:anchor="_Toc242216345" w:history="1">
+      <w:hyperlink w:anchor="_Toc242216919" w:history="1">
         <w:r>
           <w:rPr>
             <w:rStyle w:val="aff9"/>
@@ -1200,7 +1200,7 @@
             <w:noProof/>
             <w:webHidden/>
           </w:rPr>
-          <w:instrText>PAGEREF _Toc242216345 \h</w:instrText>
+          <w:instrText>PAGEREF _Toc242216919 \h</w:instrText>
         </w:r>
         <w:r>
           <w:rPr>
@@ -1258,7 +1258,7 @@
           <w14:ligatures w14:val="standardContextual"/>
         </w:rPr>
       </w:pPr>
-      <w:hyperlink w:anchor="_Toc242216346" w:history="1">
+      <w:hyperlink w:anchor="_Toc242216920" w:history="1">
         <w:r>
           <w:rPr>
             <w:rStyle w:val="aff9"/>
@@ -1296,7 +1296,7 @@
             <w:noProof/>
             <w:webHidden/>
           </w:rPr>
-          <w:instrText>PAGEREF _Toc242216346 \h</w:instrText>
+          <w:instrText>PAGEREF _Toc242216920 \h</w:instrText>
         </w:r>
         <w:r>
           <w:rPr>
@@ -1354,7 +1354,7 @@
           <w14:ligatures w14:val="standardContextual"/>
         </w:rPr>
       </w:pPr>
-      <w:hyperlink w:anchor="_Toc242216347" w:history="1">
+      <w:hyperlink w:anchor="_Toc242216921" w:history="1">
         <w:r>
           <w:rPr>
             <w:rStyle w:val="aff9"/>
@@ -1392,7 +1392,7 @@
             <w:noProof/>
             <w:webHidden/>
           </w:rPr>
-          <w:instrText>PAGEREF _Toc242216347 \h</w:instrText>
+          <w:instrText>PAGEREF _Toc242216921 \h</w:instrText>
         </w:r>
         <w:r>
           <w:rPr>
@@ -1450,7 +1450,7 @@
           <w14:ligatures w14:val="standardContextual"/>
         </w:rPr>
       </w:pPr>
-      <w:hyperlink w:anchor="_Toc242216348" w:history="1">
+      <w:hyperlink w:anchor="_Toc242216922" w:history="1">
         <w:r>
           <w:rPr>
             <w:rStyle w:val="aff9"/>
@@ -1488,7 +1488,7 @@
             <w:noProof/>
             <w:webHidden/>
           </w:rPr>
-          <w:instrText>PAGEREF _Toc242216348 \h</w:instrText>
+          <w:instrText>PAGEREF _Toc242216922 \h</w:instrText>
         </w:r>
         <w:r>
           <w:rPr>
@@ -1543,7 +1543,7 @@
         <w:pStyle w:val="1"/>
         <w:spacing w:before="280" w:after="120"/>
       </w:pPr>
-      <w:bookmarkStart w:id="0" w:name="_Toc242216335"/>
+      <w:bookmarkStart w:id="0" w:name="_Toc242216909"/>
       <w:r>
         <w:rPr>
           <w:rFonts w:ascii="Times New Roman" w:eastAsia="Arial" w:hAnsi="Times New Roman"/>
@@ -1992,7 +1992,7 @@
         <w:pStyle w:val="1"/>
         <w:spacing w:before="280" w:after="120"/>
       </w:pPr>
-      <w:bookmarkStart w:id="1" w:name="_Toc242216336"/>
+      <w:bookmarkStart w:id="1" w:name="_Toc242216910"/>
       <w:r>
         <w:rPr>
           <w:rFonts w:ascii="Times New Roman" w:eastAsia="Arial" w:hAnsi="Times New Roman"/>
@@ -2040,7 +2040,7 @@
         <w:pStyle w:val="1"/>
         <w:spacing w:before="280" w:after="120"/>
       </w:pPr>
-      <w:bookmarkStart w:id="2" w:name="_Toc242216337"/>
+      <w:bookmarkStart w:id="2" w:name="_Toc242216911"/>
       <w:r>
         <w:rPr>
           <w:rFonts w:ascii="Times New Roman" w:eastAsia="Arial" w:hAnsi="Times New Roman"/>
@@ -2460,7 +2460,7 @@
         <w:pStyle w:val="1"/>
         <w:spacing w:before="280" w:after="120"/>
       </w:pPr>
-      <w:bookmarkStart w:id="3" w:name="_Toc242216338"/>
+      <w:bookmarkStart w:id="3" w:name="_Toc242216912"/>
       <w:r>
         <w:rPr>
           <w:rFonts w:ascii="Times New Roman" w:eastAsia="Arial" w:hAnsi="Times New Roman"/>
@@ -2967,7 +2967,7 @@
         <w:pStyle w:val="1"/>
         <w:spacing w:before="280" w:after="120"/>
       </w:pPr>
-      <w:bookmarkStart w:id="4" w:name="_Toc242216339"/>
+      <w:bookmarkStart w:id="4" w:name="_Toc242216913"/>
       <w:r>
         <w:rPr>
           <w:rFonts w:ascii="Times New Roman" w:eastAsia="Arial" w:hAnsi="Times New Roman"/>
@@ -3421,7 +3421,7 @@
         <w:pStyle w:val="1"/>
         <w:spacing w:before="280" w:after="120"/>
       </w:pPr>
-      <w:bookmarkStart w:id="5" w:name="_Toc242216340"/>
+      <w:bookmarkStart w:id="5" w:name="_Toc242216914"/>
       <w:r>
         <w:rPr>
           <w:rFonts w:ascii="Times New Roman" w:eastAsia="Arial" w:hAnsi="Times New Roman"/>
@@ -3593,7 +3593,7 @@
         <w:pStyle w:val="1"/>
         <w:spacing w:before="280" w:after="120"/>
       </w:pPr>
-      <w:bookmarkStart w:id="6" w:name="_Toc242216341"/>
+      <w:bookmarkStart w:id="6" w:name="_Toc242216915"/>
       <w:r>
         <w:rPr>
           <w:rFonts w:ascii="Times New Roman" w:eastAsia="Arial" w:hAnsi="Times New Roman"/>
@@ -3799,7 +3799,7 @@
         <w:pStyle w:val="1"/>
         <w:spacing w:before="280" w:after="120"/>
       </w:pPr>
-      <w:bookmarkStart w:id="7" w:name="_Toc242216342"/>
+      <w:bookmarkStart w:id="7" w:name="_Toc242216916"/>
       <w:r>
         <w:rPr>
           <w:rFonts w:ascii="Times New Roman" w:eastAsia="Arial" w:hAnsi="Times New Roman"/>
@@ -3943,7 +3943,7 @@
         <w:pStyle w:val="1"/>
         <w:spacing w:before="280" w:after="120"/>
       </w:pPr>
-      <w:bookmarkStart w:id="8" w:name="_Toc242216343"/>
+      <w:bookmarkStart w:id="8" w:name="_Toc242216917"/>
       <w:r>
         <w:rPr>
           <w:rFonts w:ascii="Times New Roman" w:eastAsia="Arial" w:hAnsi="Times New Roman"/>
@@ -4252,7 +4252,7 @@
         <w:pStyle w:val="1"/>
         <w:spacing w:before="280" w:after="120"/>
       </w:pPr>
-      <w:bookmarkStart w:id="9" w:name="_Toc242216344"/>
+      <w:bookmarkStart w:id="9" w:name="_Toc242216918"/>
       <w:r>
         <w:rPr>
           <w:rFonts w:ascii="Times New Roman" w:eastAsia="Arial" w:hAnsi="Times New Roman"/>
@@ -4348,7 +4348,7 @@
         <w:pStyle w:val="1"/>
         <w:spacing w:before="280" w:after="120"/>
       </w:pPr>
-      <w:bookmarkStart w:id="10" w:name="_Toc242216345"/>
+      <w:bookmarkStart w:id="10" w:name="_Toc242216919"/>
       <w:r>
         <w:rPr>
           <w:rFonts w:ascii="Times New Roman" w:eastAsia="Arial" w:hAnsi="Times New Roman"/>
@@ -4454,7 +4454,7 @@
         <w:pStyle w:val="1"/>
         <w:spacing w:before="280" w:after="120"/>
       </w:pPr>
-      <w:bookmarkStart w:id="11" w:name="_Toc242216346"/>
+      <w:bookmarkStart w:id="11" w:name="_Toc242216920"/>
       <w:r>
         <w:rPr>
           <w:rFonts w:ascii="Times New Roman" w:eastAsia="Arial" w:hAnsi="Times New Roman"/>
@@ -4619,7 +4619,7 @@
         <w:pStyle w:val="1"/>
         <w:spacing w:before="280" w:after="120"/>
       </w:pPr>
-      <w:bookmarkStart w:id="12" w:name="_Toc242216347"/>
+      <w:bookmarkStart w:id="12" w:name="_Toc242216921"/>
       <w:r>
         <w:rPr>
           <w:rFonts w:ascii="Times New Roman" w:eastAsia="Arial" w:hAnsi="Times New Roman"/>
@@ -4857,7 +4857,7 @@
         <w:pStyle w:val="1"/>
         <w:spacing w:before="280" w:after="120"/>
       </w:pPr>
-      <w:bookmarkStart w:id="13" w:name="_Toc242216348"/>
+      <w:bookmarkStart w:id="13" w:name="_Toc242216922"/>
       <w:r>
         <w:rPr>
           <w:rFonts w:ascii="Times New Roman" w:eastAsia="Arial" w:hAnsi="Times New Roman"/>
@@ -5010,7 +5010,23 @@
         <w:rPr>
           <w:color w:val="000000"/>
         </w:rPr>
-        <w:t>remain advisable but the variable no longer merely counts calendar time.</w:t>
+        <w:t>remain advisable but the variable no longer merely counts calendar time. For the censored</w:t>
+      </w:r>
+    </w:p>
+    <w:p>
+      <w:r>
+        <w:rPr>
+          <w:color w:val="000000"/>
+        </w:rPr>
+        <w:t>group the value is a lower bound on true tenure, so the seniority coefficient is</w:t>
+      </w:r>
+    </w:p>
+    <w:p>
+      <w:r>
+        <w:rPr>
+          <w:color w:val="000000"/>
+        </w:rPr>
+        <w:t>attenuated rather than inflated, and a robustness run drops those events.</w:t>
       </w:r>
     </w:p>
     <w:p>
@@ -5644,31 +5660,31 @@
       </w:rPr>
     </w:lvl>
   </w:abstractNum>
-  <w:num w:numId="1" w16cid:durableId="964236965">
+  <w:num w:numId="1" w16cid:durableId="1488204532">
     <w:abstractNumId w:val="8"/>
   </w:num>
-  <w:num w:numId="2" w16cid:durableId="181476513">
+  <w:num w:numId="2" w16cid:durableId="573976477">
     <w:abstractNumId w:val="6"/>
   </w:num>
-  <w:num w:numId="3" w16cid:durableId="1414861222">
+  <w:num w:numId="3" w16cid:durableId="1798571884">
     <w:abstractNumId w:val="5"/>
   </w:num>
-  <w:num w:numId="4" w16cid:durableId="1558010646">
+  <w:num w:numId="4" w16cid:durableId="1496187695">
     <w:abstractNumId w:val="4"/>
   </w:num>
-  <w:num w:numId="5" w16cid:durableId="70978891">
+  <w:num w:numId="5" w16cid:durableId="1041856606">
     <w:abstractNumId w:val="7"/>
   </w:num>
-  <w:num w:numId="6" w16cid:durableId="853037119">
+  <w:num w:numId="6" w16cid:durableId="1678923084">
     <w:abstractNumId w:val="3"/>
   </w:num>
-  <w:num w:numId="7" w16cid:durableId="783228979">
+  <w:num w:numId="7" w16cid:durableId="840656680">
     <w:abstractNumId w:val="2"/>
   </w:num>
-  <w:num w:numId="8" w16cid:durableId="700592055">
+  <w:num w:numId="8" w16cid:durableId="398097432">
     <w:abstractNumId w:val="1"/>
   </w:num>
-  <w:num w:numId="9" w16cid:durableId="1763380590">
+  <w:num w:numId="9" w16cid:durableId="1287081482">
     <w:abstractNumId w:val="0"/>
   </w:num>
 </w:numbering>
@@ -17067,14 +17083,14 @@
     <w:autoRedefine/>
     <w:uiPriority w:val="39"/>
     <w:unhideWhenUsed/>
-    <w:rsid w:val="00DC402E"/>
+    <w:rsid w:val="00EB36EF"/>
   </w:style>
   <w:style w:type="character" w:styleId="aff9">
     <w:name w:val="Hyperlink"/>
     <w:basedOn w:val="a2"/>
     <w:uiPriority w:val="99"/>
     <w:unhideWhenUsed/>
-    <w:rsid w:val="00DC402E"/>
+    <w:rsid w:val="00EB36EF"/>
     <w:rPr>
       <w:color w:val="0000FF" w:themeColor="hyperlink"/>
       <w:u w:val="single"/>

</xml_diff>

<commit_message>
Give the size of the censored cohort in the limitation
2,674 events, 12.7% of the sample, and 18.5% of all star events.

Co-Authored-By: Claude Fable 5.1 <noreply@anthropic.com>
</commit_message>
<xml_diff>
--- a/Project10_Star_Analyst_Research_Plan_EN.docx
+++ b/Project10_Star_Analyst_Research_Plan_EN.docx
@@ -202,7 +202,7 @@
         </w:rPr>
         <w:fldChar w:fldCharType="separate"/>
       </w:r>
-      <w:hyperlink w:anchor="_Toc242216909" w:history="1">
+      <w:hyperlink w:anchor="_Toc242216971" w:history="1">
         <w:r>
           <w:rPr>
             <w:rStyle w:val="aff9"/>
@@ -240,7 +240,7 @@
             <w:noProof/>
             <w:webHidden/>
           </w:rPr>
-          <w:instrText>PAGEREF _Toc242216909 \h</w:instrText>
+          <w:instrText>PAGEREF _Toc242216971 \h</w:instrText>
         </w:r>
         <w:r>
           <w:rPr>
@@ -298,7 +298,7 @@
           <w14:ligatures w14:val="standardContextual"/>
         </w:rPr>
       </w:pPr>
-      <w:hyperlink w:anchor="_Toc242216910" w:history="1">
+      <w:hyperlink w:anchor="_Toc242216972" w:history="1">
         <w:r>
           <w:rPr>
             <w:rStyle w:val="aff9"/>
@@ -336,7 +336,7 @@
             <w:noProof/>
             <w:webHidden/>
           </w:rPr>
-          <w:instrText>PAGEREF _Toc242216910 \h</w:instrText>
+          <w:instrText>PAGEREF _Toc242216972 \h</w:instrText>
         </w:r>
         <w:r>
           <w:rPr>
@@ -394,7 +394,7 @@
           <w14:ligatures w14:val="standardContextual"/>
         </w:rPr>
       </w:pPr>
-      <w:hyperlink w:anchor="_Toc242216911" w:history="1">
+      <w:hyperlink w:anchor="_Toc242216973" w:history="1">
         <w:r>
           <w:rPr>
             <w:rStyle w:val="aff9"/>
@@ -432,7 +432,7 @@
             <w:noProof/>
             <w:webHidden/>
           </w:rPr>
-          <w:instrText>PAGEREF _Toc242216911 \h</w:instrText>
+          <w:instrText>PAGEREF _Toc242216973 \h</w:instrText>
         </w:r>
         <w:r>
           <w:rPr>
@@ -490,7 +490,7 @@
           <w14:ligatures w14:val="standardContextual"/>
         </w:rPr>
       </w:pPr>
-      <w:hyperlink w:anchor="_Toc242216912" w:history="1">
+      <w:hyperlink w:anchor="_Toc242216974" w:history="1">
         <w:r>
           <w:rPr>
             <w:rStyle w:val="aff9"/>
@@ -528,7 +528,7 @@
             <w:noProof/>
             <w:webHidden/>
           </w:rPr>
-          <w:instrText>PAGEREF _Toc242216912 \h</w:instrText>
+          <w:instrText>PAGEREF _Toc242216974 \h</w:instrText>
         </w:r>
         <w:r>
           <w:rPr>
@@ -586,7 +586,7 @@
           <w14:ligatures w14:val="standardContextual"/>
         </w:rPr>
       </w:pPr>
-      <w:hyperlink w:anchor="_Toc242216913" w:history="1">
+      <w:hyperlink w:anchor="_Toc242216975" w:history="1">
         <w:r>
           <w:rPr>
             <w:rStyle w:val="aff9"/>
@@ -624,7 +624,7 @@
             <w:noProof/>
             <w:webHidden/>
           </w:rPr>
-          <w:instrText>PAGEREF _Toc242216913 \h</w:instrText>
+          <w:instrText>PAGEREF _Toc242216975 \h</w:instrText>
         </w:r>
         <w:r>
           <w:rPr>
@@ -682,7 +682,7 @@
           <w14:ligatures w14:val="standardContextual"/>
         </w:rPr>
       </w:pPr>
-      <w:hyperlink w:anchor="_Toc242216914" w:history="1">
+      <w:hyperlink w:anchor="_Toc242216976" w:history="1">
         <w:r>
           <w:rPr>
             <w:rStyle w:val="aff9"/>
@@ -720,7 +720,7 @@
             <w:noProof/>
             <w:webHidden/>
           </w:rPr>
-          <w:instrText>PAGEREF _Toc242216914 \h</w:instrText>
+          <w:instrText>PAGEREF _Toc242216976 \h</w:instrText>
         </w:r>
         <w:r>
           <w:rPr>
@@ -778,7 +778,7 @@
           <w14:ligatures w14:val="standardContextual"/>
         </w:rPr>
       </w:pPr>
-      <w:hyperlink w:anchor="_Toc242216915" w:history="1">
+      <w:hyperlink w:anchor="_Toc242216977" w:history="1">
         <w:r>
           <w:rPr>
             <w:rStyle w:val="aff9"/>
@@ -816,7 +816,7 @@
             <w:noProof/>
             <w:webHidden/>
           </w:rPr>
-          <w:instrText>PAGEREF _Toc242216915 \h</w:instrText>
+          <w:instrText>PAGEREF _Toc242216977 \h</w:instrText>
         </w:r>
         <w:r>
           <w:rPr>
@@ -874,7 +874,7 @@
           <w14:ligatures w14:val="standardContextual"/>
         </w:rPr>
       </w:pPr>
-      <w:hyperlink w:anchor="_Toc242216916" w:history="1">
+      <w:hyperlink w:anchor="_Toc242216978" w:history="1">
         <w:r>
           <w:rPr>
             <w:rStyle w:val="aff9"/>
@@ -912,7 +912,7 @@
             <w:noProof/>
             <w:webHidden/>
           </w:rPr>
-          <w:instrText>PAGEREF _Toc242216916 \h</w:instrText>
+          <w:instrText>PAGEREF _Toc242216978 \h</w:instrText>
         </w:r>
         <w:r>
           <w:rPr>
@@ -970,7 +970,7 @@
           <w14:ligatures w14:val="standardContextual"/>
         </w:rPr>
       </w:pPr>
-      <w:hyperlink w:anchor="_Toc242216917" w:history="1">
+      <w:hyperlink w:anchor="_Toc242216979" w:history="1">
         <w:r>
           <w:rPr>
             <w:rStyle w:val="aff9"/>
@@ -1008,7 +1008,7 @@
             <w:noProof/>
             <w:webHidden/>
           </w:rPr>
-          <w:instrText>PAGEREF _Toc242216917 \h</w:instrText>
+          <w:instrText>PAGEREF _Toc242216979 \h</w:instrText>
         </w:r>
         <w:r>
           <w:rPr>
@@ -1066,7 +1066,7 @@
           <w14:ligatures w14:val="standardContextual"/>
         </w:rPr>
       </w:pPr>
-      <w:hyperlink w:anchor="_Toc242216918" w:history="1">
+      <w:hyperlink w:anchor="_Toc242216980" w:history="1">
         <w:r>
           <w:rPr>
             <w:rStyle w:val="aff9"/>
@@ -1104,7 +1104,7 @@
             <w:noProof/>
             <w:webHidden/>
           </w:rPr>
-          <w:instrText>PAGEREF _Toc242216918 \h</w:instrText>
+          <w:instrText>PAGEREF _Toc242216980 \h</w:instrText>
         </w:r>
         <w:r>
           <w:rPr>
@@ -1162,7 +1162,7 @@
           <w14:ligatures w14:val="standardContextual"/>
         </w:rPr>
       </w:pPr>
-      <w:hyperlink w:anchor="_Toc242216919" w:history="1">
+      <w:hyperlink w:anchor="_Toc242216981" w:history="1">
         <w:r>
           <w:rPr>
             <w:rStyle w:val="aff9"/>
@@ -1200,7 +1200,7 @@
             <w:noProof/>
             <w:webHidden/>
           </w:rPr>
-          <w:instrText>PAGEREF _Toc242216919 \h</w:instrText>
+          <w:instrText>PAGEREF _Toc242216981 \h</w:instrText>
         </w:r>
         <w:r>
           <w:rPr>
@@ -1258,7 +1258,7 @@
           <w14:ligatures w14:val="standardContextual"/>
         </w:rPr>
       </w:pPr>
-      <w:hyperlink w:anchor="_Toc242216920" w:history="1">
+      <w:hyperlink w:anchor="_Toc242216982" w:history="1">
         <w:r>
           <w:rPr>
             <w:rStyle w:val="aff9"/>
@@ -1296,7 +1296,7 @@
             <w:noProof/>
             <w:webHidden/>
           </w:rPr>
-          <w:instrText>PAGEREF _Toc242216920 \h</w:instrText>
+          <w:instrText>PAGEREF _Toc242216982 \h</w:instrText>
         </w:r>
         <w:r>
           <w:rPr>
@@ -1354,7 +1354,7 @@
           <w14:ligatures w14:val="standardContextual"/>
         </w:rPr>
       </w:pPr>
-      <w:hyperlink w:anchor="_Toc242216921" w:history="1">
+      <w:hyperlink w:anchor="_Toc242216983" w:history="1">
         <w:r>
           <w:rPr>
             <w:rStyle w:val="aff9"/>
@@ -1392,7 +1392,7 @@
             <w:noProof/>
             <w:webHidden/>
           </w:rPr>
-          <w:instrText>PAGEREF _Toc242216921 \h</w:instrText>
+          <w:instrText>PAGEREF _Toc242216983 \h</w:instrText>
         </w:r>
         <w:r>
           <w:rPr>
@@ -1450,7 +1450,7 @@
           <w14:ligatures w14:val="standardContextual"/>
         </w:rPr>
       </w:pPr>
-      <w:hyperlink w:anchor="_Toc242216922" w:history="1">
+      <w:hyperlink w:anchor="_Toc242216984" w:history="1">
         <w:r>
           <w:rPr>
             <w:rStyle w:val="aff9"/>
@@ -1488,7 +1488,7 @@
             <w:noProof/>
             <w:webHidden/>
           </w:rPr>
-          <w:instrText>PAGEREF _Toc242216922 \h</w:instrText>
+          <w:instrText>PAGEREF _Toc242216984 \h</w:instrText>
         </w:r>
         <w:r>
           <w:rPr>
@@ -1543,7 +1543,7 @@
         <w:pStyle w:val="1"/>
         <w:spacing w:before="280" w:after="120"/>
       </w:pPr>
-      <w:bookmarkStart w:id="0" w:name="_Toc242216909"/>
+      <w:bookmarkStart w:id="0" w:name="_Toc242216971"/>
       <w:r>
         <w:rPr>
           <w:rFonts w:ascii="Times New Roman" w:eastAsia="Arial" w:hAnsi="Times New Roman"/>
@@ -1992,7 +1992,7 @@
         <w:pStyle w:val="1"/>
         <w:spacing w:before="280" w:after="120"/>
       </w:pPr>
-      <w:bookmarkStart w:id="1" w:name="_Toc242216910"/>
+      <w:bookmarkStart w:id="1" w:name="_Toc242216972"/>
       <w:r>
         <w:rPr>
           <w:rFonts w:ascii="Times New Roman" w:eastAsia="Arial" w:hAnsi="Times New Roman"/>
@@ -2040,7 +2040,7 @@
         <w:pStyle w:val="1"/>
         <w:spacing w:before="280" w:after="120"/>
       </w:pPr>
-      <w:bookmarkStart w:id="2" w:name="_Toc242216911"/>
+      <w:bookmarkStart w:id="2" w:name="_Toc242216973"/>
       <w:r>
         <w:rPr>
           <w:rFonts w:ascii="Times New Roman" w:eastAsia="Arial" w:hAnsi="Times New Roman"/>
@@ -2460,7 +2460,7 @@
         <w:pStyle w:val="1"/>
         <w:spacing w:before="280" w:after="120"/>
       </w:pPr>
-      <w:bookmarkStart w:id="3" w:name="_Toc242216912"/>
+      <w:bookmarkStart w:id="3" w:name="_Toc242216974"/>
       <w:r>
         <w:rPr>
           <w:rFonts w:ascii="Times New Roman" w:eastAsia="Arial" w:hAnsi="Times New Roman"/>
@@ -2967,7 +2967,7 @@
         <w:pStyle w:val="1"/>
         <w:spacing w:before="280" w:after="120"/>
       </w:pPr>
-      <w:bookmarkStart w:id="4" w:name="_Toc242216913"/>
+      <w:bookmarkStart w:id="4" w:name="_Toc242216975"/>
       <w:r>
         <w:rPr>
           <w:rFonts w:ascii="Times New Roman" w:eastAsia="Arial" w:hAnsi="Times New Roman"/>
@@ -3421,7 +3421,7 @@
         <w:pStyle w:val="1"/>
         <w:spacing w:before="280" w:after="120"/>
       </w:pPr>
-      <w:bookmarkStart w:id="5" w:name="_Toc242216914"/>
+      <w:bookmarkStart w:id="5" w:name="_Toc242216976"/>
       <w:r>
         <w:rPr>
           <w:rFonts w:ascii="Times New Roman" w:eastAsia="Arial" w:hAnsi="Times New Roman"/>
@@ -3593,7 +3593,7 @@
         <w:pStyle w:val="1"/>
         <w:spacing w:before="280" w:after="120"/>
       </w:pPr>
-      <w:bookmarkStart w:id="6" w:name="_Toc242216915"/>
+      <w:bookmarkStart w:id="6" w:name="_Toc242216977"/>
       <w:r>
         <w:rPr>
           <w:rFonts w:ascii="Times New Roman" w:eastAsia="Arial" w:hAnsi="Times New Roman"/>
@@ -3799,7 +3799,7 @@
         <w:pStyle w:val="1"/>
         <w:spacing w:before="280" w:after="120"/>
       </w:pPr>
-      <w:bookmarkStart w:id="7" w:name="_Toc242216916"/>
+      <w:bookmarkStart w:id="7" w:name="_Toc242216978"/>
       <w:r>
         <w:rPr>
           <w:rFonts w:ascii="Times New Roman" w:eastAsia="Arial" w:hAnsi="Times New Roman"/>
@@ -3943,7 +3943,7 @@
         <w:pStyle w:val="1"/>
         <w:spacing w:before="280" w:after="120"/>
       </w:pPr>
-      <w:bookmarkStart w:id="8" w:name="_Toc242216917"/>
+      <w:bookmarkStart w:id="8" w:name="_Toc242216979"/>
       <w:r>
         <w:rPr>
           <w:rFonts w:ascii="Times New Roman" w:eastAsia="Arial" w:hAnsi="Times New Roman"/>
@@ -4252,7 +4252,7 @@
         <w:pStyle w:val="1"/>
         <w:spacing w:before="280" w:after="120"/>
       </w:pPr>
-      <w:bookmarkStart w:id="9" w:name="_Toc242216918"/>
+      <w:bookmarkStart w:id="9" w:name="_Toc242216980"/>
       <w:r>
         <w:rPr>
           <w:rFonts w:ascii="Times New Roman" w:eastAsia="Arial" w:hAnsi="Times New Roman"/>
@@ -4348,7 +4348,7 @@
         <w:pStyle w:val="1"/>
         <w:spacing w:before="280" w:after="120"/>
       </w:pPr>
-      <w:bookmarkStart w:id="10" w:name="_Toc242216919"/>
+      <w:bookmarkStart w:id="10" w:name="_Toc242216981"/>
       <w:r>
         <w:rPr>
           <w:rFonts w:ascii="Times New Roman" w:eastAsia="Arial" w:hAnsi="Times New Roman"/>
@@ -4454,7 +4454,7 @@
         <w:pStyle w:val="1"/>
         <w:spacing w:before="280" w:after="120"/>
       </w:pPr>
-      <w:bookmarkStart w:id="11" w:name="_Toc242216920"/>
+      <w:bookmarkStart w:id="11" w:name="_Toc242216982"/>
       <w:r>
         <w:rPr>
           <w:rFonts w:ascii="Times New Roman" w:eastAsia="Arial" w:hAnsi="Times New Roman"/>
@@ -4619,7 +4619,7 @@
         <w:pStyle w:val="1"/>
         <w:spacing w:before="280" w:after="120"/>
       </w:pPr>
-      <w:bookmarkStart w:id="12" w:name="_Toc242216921"/>
+      <w:bookmarkStart w:id="12" w:name="_Toc242216983"/>
       <w:r>
         <w:rPr>
           <w:rFonts w:ascii="Times New Roman" w:eastAsia="Arial" w:hAnsi="Times New Roman"/>
@@ -4857,7 +4857,7 @@
         <w:pStyle w:val="1"/>
         <w:spacing w:before="280" w:after="120"/>
       </w:pPr>
-      <w:bookmarkStart w:id="13" w:name="_Toc242216922"/>
+      <w:bookmarkStart w:id="13" w:name="_Toc242216984"/>
       <w:r>
         <w:rPr>
           <w:rFonts w:ascii="Times New Roman" w:eastAsia="Arial" w:hAnsi="Times New Roman"/>
@@ -5026,7 +5026,15 @@
         <w:rPr>
           <w:color w:val="000000"/>
         </w:rPr>
-        <w:t>attenuated rather than inflated, and a robustness run drops those events.</w:t>
+        <w:t>attenuated rather than inflated. A robustness run drops that cohort, which is 2,674</w:t>
+      </w:r>
+    </w:p>
+    <w:p>
+      <w:r>
+        <w:rPr>
+          <w:color w:val="000000"/>
+        </w:rPr>
+        <w:t>events (12.7% of the sample) and 18.5% of all star events.</w:t>
       </w:r>
     </w:p>
     <w:p>
@@ -5660,31 +5668,31 @@
       </w:rPr>
     </w:lvl>
   </w:abstractNum>
-  <w:num w:numId="1" w16cid:durableId="1488204532">
+  <w:num w:numId="1" w16cid:durableId="49118906">
     <w:abstractNumId w:val="8"/>
   </w:num>
-  <w:num w:numId="2" w16cid:durableId="573976477">
+  <w:num w:numId="2" w16cid:durableId="2082634342">
     <w:abstractNumId w:val="6"/>
   </w:num>
-  <w:num w:numId="3" w16cid:durableId="1798571884">
+  <w:num w:numId="3" w16cid:durableId="779295819">
     <w:abstractNumId w:val="5"/>
   </w:num>
-  <w:num w:numId="4" w16cid:durableId="1496187695">
+  <w:num w:numId="4" w16cid:durableId="133448475">
     <w:abstractNumId w:val="4"/>
   </w:num>
-  <w:num w:numId="5" w16cid:durableId="1041856606">
+  <w:num w:numId="5" w16cid:durableId="205217931">
     <w:abstractNumId w:val="7"/>
   </w:num>
-  <w:num w:numId="6" w16cid:durableId="1678923084">
+  <w:num w:numId="6" w16cid:durableId="2099448340">
     <w:abstractNumId w:val="3"/>
   </w:num>
-  <w:num w:numId="7" w16cid:durableId="840656680">
+  <w:num w:numId="7" w16cid:durableId="999651641">
     <w:abstractNumId w:val="2"/>
   </w:num>
-  <w:num w:numId="8" w16cid:durableId="398097432">
+  <w:num w:numId="8" w16cid:durableId="367805276">
     <w:abstractNumId w:val="1"/>
   </w:num>
-  <w:num w:numId="9" w16cid:durableId="1287081482">
+  <w:num w:numId="9" w16cid:durableId="1283537656">
     <w:abstractNumId w:val="0"/>
   </w:num>
 </w:numbering>
@@ -17083,14 +17091,14 @@
     <w:autoRedefine/>
     <w:uiPriority w:val="39"/>
     <w:unhideWhenUsed/>
-    <w:rsid w:val="00EB36EF"/>
+    <w:rsid w:val="005E40D3"/>
   </w:style>
   <w:style w:type="character" w:styleId="aff9">
     <w:name w:val="Hyperlink"/>
     <w:basedOn w:val="a2"/>
     <w:uiPriority w:val="99"/>
     <w:unhideWhenUsed/>
-    <w:rsid w:val="00EB36EF"/>
+    <w:rsid w:val="005E40D3"/>
     <w:rPr>
       <w:color w:val="0000FF" w:themeColor="hyperlink"/>
       <w:u w:val="single"/>

</xml_diff>

<commit_message>
State how the June 2009 floor was measured and fix a stale comment
A query for 2009 returns 27,059 rows, for 2008 two, and the earliest first-report date we
can observe is 2009-06-15. The tenure script still described the older 2010 boundary.

Co-Authored-By: Claude Fable 5.1 <noreply@anthropic.com>
</commit_message>
<xml_diff>
--- a/Project10_Star_Analyst_Research_Plan_EN.docx
+++ b/Project10_Star_Analyst_Research_Plan_EN.docx
@@ -202,7 +202,7 @@
         </w:rPr>
         <w:fldChar w:fldCharType="separate"/>
       </w:r>
-      <w:hyperlink w:anchor="_Toc242216971" w:history="1">
+      <w:hyperlink w:anchor="_Toc242217868" w:history="1">
         <w:r>
           <w:rPr>
             <w:rStyle w:val="aff9"/>
@@ -240,7 +240,7 @@
             <w:noProof/>
             <w:webHidden/>
           </w:rPr>
-          <w:instrText>PAGEREF _Toc242216971 \h</w:instrText>
+          <w:instrText>PAGEREF _Toc242217868 \h</w:instrText>
         </w:r>
         <w:r>
           <w:rPr>
@@ -298,7 +298,7 @@
           <w14:ligatures w14:val="standardContextual"/>
         </w:rPr>
       </w:pPr>
-      <w:hyperlink w:anchor="_Toc242216972" w:history="1">
+      <w:hyperlink w:anchor="_Toc242217869" w:history="1">
         <w:r>
           <w:rPr>
             <w:rStyle w:val="aff9"/>
@@ -336,7 +336,7 @@
             <w:noProof/>
             <w:webHidden/>
           </w:rPr>
-          <w:instrText>PAGEREF _Toc242216972 \h</w:instrText>
+          <w:instrText>PAGEREF _Toc242217869 \h</w:instrText>
         </w:r>
         <w:r>
           <w:rPr>
@@ -394,7 +394,7 @@
           <w14:ligatures w14:val="standardContextual"/>
         </w:rPr>
       </w:pPr>
-      <w:hyperlink w:anchor="_Toc242216973" w:history="1">
+      <w:hyperlink w:anchor="_Toc242217870" w:history="1">
         <w:r>
           <w:rPr>
             <w:rStyle w:val="aff9"/>
@@ -432,7 +432,7 @@
             <w:noProof/>
             <w:webHidden/>
           </w:rPr>
-          <w:instrText>PAGEREF _Toc242216973 \h</w:instrText>
+          <w:instrText>PAGEREF _Toc242217870 \h</w:instrText>
         </w:r>
         <w:r>
           <w:rPr>
@@ -490,7 +490,7 @@
           <w14:ligatures w14:val="standardContextual"/>
         </w:rPr>
       </w:pPr>
-      <w:hyperlink w:anchor="_Toc242216974" w:history="1">
+      <w:hyperlink w:anchor="_Toc242217871" w:history="1">
         <w:r>
           <w:rPr>
             <w:rStyle w:val="aff9"/>
@@ -528,7 +528,7 @@
             <w:noProof/>
             <w:webHidden/>
           </w:rPr>
-          <w:instrText>PAGEREF _Toc242216974 \h</w:instrText>
+          <w:instrText>PAGEREF _Toc242217871 \h</w:instrText>
         </w:r>
         <w:r>
           <w:rPr>
@@ -586,7 +586,7 @@
           <w14:ligatures w14:val="standardContextual"/>
         </w:rPr>
       </w:pPr>
-      <w:hyperlink w:anchor="_Toc242216975" w:history="1">
+      <w:hyperlink w:anchor="_Toc242217872" w:history="1">
         <w:r>
           <w:rPr>
             <w:rStyle w:val="aff9"/>
@@ -624,7 +624,7 @@
             <w:noProof/>
             <w:webHidden/>
           </w:rPr>
-          <w:instrText>PAGEREF _Toc242216975 \h</w:instrText>
+          <w:instrText>PAGEREF _Toc242217872 \h</w:instrText>
         </w:r>
         <w:r>
           <w:rPr>
@@ -682,7 +682,7 @@
           <w14:ligatures w14:val="standardContextual"/>
         </w:rPr>
       </w:pPr>
-      <w:hyperlink w:anchor="_Toc242216976" w:history="1">
+      <w:hyperlink w:anchor="_Toc242217873" w:history="1">
         <w:r>
           <w:rPr>
             <w:rStyle w:val="aff9"/>
@@ -720,7 +720,7 @@
             <w:noProof/>
             <w:webHidden/>
           </w:rPr>
-          <w:instrText>PAGEREF _Toc242216976 \h</w:instrText>
+          <w:instrText>PAGEREF _Toc242217873 \h</w:instrText>
         </w:r>
         <w:r>
           <w:rPr>
@@ -778,7 +778,7 @@
           <w14:ligatures w14:val="standardContextual"/>
         </w:rPr>
       </w:pPr>
-      <w:hyperlink w:anchor="_Toc242216977" w:history="1">
+      <w:hyperlink w:anchor="_Toc242217874" w:history="1">
         <w:r>
           <w:rPr>
             <w:rStyle w:val="aff9"/>
@@ -816,7 +816,7 @@
             <w:noProof/>
             <w:webHidden/>
           </w:rPr>
-          <w:instrText>PAGEREF _Toc242216977 \h</w:instrText>
+          <w:instrText>PAGEREF _Toc242217874 \h</w:instrText>
         </w:r>
         <w:r>
           <w:rPr>
@@ -874,7 +874,7 @@
           <w14:ligatures w14:val="standardContextual"/>
         </w:rPr>
       </w:pPr>
-      <w:hyperlink w:anchor="_Toc242216978" w:history="1">
+      <w:hyperlink w:anchor="_Toc242217875" w:history="1">
         <w:r>
           <w:rPr>
             <w:rStyle w:val="aff9"/>
@@ -912,7 +912,7 @@
             <w:noProof/>
             <w:webHidden/>
           </w:rPr>
-          <w:instrText>PAGEREF _Toc242216978 \h</w:instrText>
+          <w:instrText>PAGEREF _Toc242217875 \h</w:instrText>
         </w:r>
         <w:r>
           <w:rPr>
@@ -970,7 +970,7 @@
           <w14:ligatures w14:val="standardContextual"/>
         </w:rPr>
       </w:pPr>
-      <w:hyperlink w:anchor="_Toc242216979" w:history="1">
+      <w:hyperlink w:anchor="_Toc242217876" w:history="1">
         <w:r>
           <w:rPr>
             <w:rStyle w:val="aff9"/>
@@ -1008,7 +1008,7 @@
             <w:noProof/>
             <w:webHidden/>
           </w:rPr>
-          <w:instrText>PAGEREF _Toc242216979 \h</w:instrText>
+          <w:instrText>PAGEREF _Toc242217876 \h</w:instrText>
         </w:r>
         <w:r>
           <w:rPr>
@@ -1066,7 +1066,7 @@
           <w14:ligatures w14:val="standardContextual"/>
         </w:rPr>
       </w:pPr>
-      <w:hyperlink w:anchor="_Toc242216980" w:history="1">
+      <w:hyperlink w:anchor="_Toc242217877" w:history="1">
         <w:r>
           <w:rPr>
             <w:rStyle w:val="aff9"/>
@@ -1104,7 +1104,7 @@
             <w:noProof/>
             <w:webHidden/>
           </w:rPr>
-          <w:instrText>PAGEREF _Toc242216980 \h</w:instrText>
+          <w:instrText>PAGEREF _Toc242217877 \h</w:instrText>
         </w:r>
         <w:r>
           <w:rPr>
@@ -1162,7 +1162,7 @@
           <w14:ligatures w14:val="standardContextual"/>
         </w:rPr>
       </w:pPr>
-      <w:hyperlink w:anchor="_Toc242216981" w:history="1">
+      <w:hyperlink w:anchor="_Toc242217878" w:history="1">
         <w:r>
           <w:rPr>
             <w:rStyle w:val="aff9"/>
@@ -1200,7 +1200,7 @@
             <w:noProof/>
             <w:webHidden/>
           </w:rPr>
-          <w:instrText>PAGEREF _Toc242216981 \h</w:instrText>
+          <w:instrText>PAGEREF _Toc242217878 \h</w:instrText>
         </w:r>
         <w:r>
           <w:rPr>
@@ -1258,7 +1258,7 @@
           <w14:ligatures w14:val="standardContextual"/>
         </w:rPr>
       </w:pPr>
-      <w:hyperlink w:anchor="_Toc242216982" w:history="1">
+      <w:hyperlink w:anchor="_Toc242217879" w:history="1">
         <w:r>
           <w:rPr>
             <w:rStyle w:val="aff9"/>
@@ -1296,7 +1296,7 @@
             <w:noProof/>
             <w:webHidden/>
           </w:rPr>
-          <w:instrText>PAGEREF _Toc242216982 \h</w:instrText>
+          <w:instrText>PAGEREF _Toc242217879 \h</w:instrText>
         </w:r>
         <w:r>
           <w:rPr>
@@ -1354,7 +1354,7 @@
           <w14:ligatures w14:val="standardContextual"/>
         </w:rPr>
       </w:pPr>
-      <w:hyperlink w:anchor="_Toc242216983" w:history="1">
+      <w:hyperlink w:anchor="_Toc242217880" w:history="1">
         <w:r>
           <w:rPr>
             <w:rStyle w:val="aff9"/>
@@ -1392,7 +1392,7 @@
             <w:noProof/>
             <w:webHidden/>
           </w:rPr>
-          <w:instrText>PAGEREF _Toc242216983 \h</w:instrText>
+          <w:instrText>PAGEREF _Toc242217880 \h</w:instrText>
         </w:r>
         <w:r>
           <w:rPr>
@@ -1450,7 +1450,7 @@
           <w14:ligatures w14:val="standardContextual"/>
         </w:rPr>
       </w:pPr>
-      <w:hyperlink w:anchor="_Toc242216984" w:history="1">
+      <w:hyperlink w:anchor="_Toc242217881" w:history="1">
         <w:r>
           <w:rPr>
             <w:rStyle w:val="aff9"/>
@@ -1488,7 +1488,7 @@
             <w:noProof/>
             <w:webHidden/>
           </w:rPr>
-          <w:instrText>PAGEREF _Toc242216984 \h</w:instrText>
+          <w:instrText>PAGEREF _Toc242217881 \h</w:instrText>
         </w:r>
         <w:r>
           <w:rPr>
@@ -1543,7 +1543,7 @@
         <w:pStyle w:val="1"/>
         <w:spacing w:before="280" w:after="120"/>
       </w:pPr>
-      <w:bookmarkStart w:id="0" w:name="_Toc242216971"/>
+      <w:bookmarkStart w:id="0" w:name="_Toc242217868"/>
       <w:r>
         <w:rPr>
           <w:rFonts w:ascii="Times New Roman" w:eastAsia="Arial" w:hAnsi="Times New Roman"/>
@@ -1992,7 +1992,7 @@
         <w:pStyle w:val="1"/>
         <w:spacing w:before="280" w:after="120"/>
       </w:pPr>
-      <w:bookmarkStart w:id="1" w:name="_Toc242216972"/>
+      <w:bookmarkStart w:id="1" w:name="_Toc242217869"/>
       <w:r>
         <w:rPr>
           <w:rFonts w:ascii="Times New Roman" w:eastAsia="Arial" w:hAnsi="Times New Roman"/>
@@ -2040,7 +2040,7 @@
         <w:pStyle w:val="1"/>
         <w:spacing w:before="280" w:after="120"/>
       </w:pPr>
-      <w:bookmarkStart w:id="2" w:name="_Toc242216973"/>
+      <w:bookmarkStart w:id="2" w:name="_Toc242217870"/>
       <w:r>
         <w:rPr>
           <w:rFonts w:ascii="Times New Roman" w:eastAsia="Arial" w:hAnsi="Times New Roman"/>
@@ -2460,7 +2460,7 @@
         <w:pStyle w:val="1"/>
         <w:spacing w:before="280" w:after="120"/>
       </w:pPr>
-      <w:bookmarkStart w:id="3" w:name="_Toc242216974"/>
+      <w:bookmarkStart w:id="3" w:name="_Toc242217871"/>
       <w:r>
         <w:rPr>
           <w:rFonts w:ascii="Times New Roman" w:eastAsia="Arial" w:hAnsi="Times New Roman"/>
@@ -2967,7 +2967,7 @@
         <w:pStyle w:val="1"/>
         <w:spacing w:before="280" w:after="120"/>
       </w:pPr>
-      <w:bookmarkStart w:id="4" w:name="_Toc242216975"/>
+      <w:bookmarkStart w:id="4" w:name="_Toc242217872"/>
       <w:r>
         <w:rPr>
           <w:rFonts w:ascii="Times New Roman" w:eastAsia="Arial" w:hAnsi="Times New Roman"/>
@@ -3421,7 +3421,7 @@
         <w:pStyle w:val="1"/>
         <w:spacing w:before="280" w:after="120"/>
       </w:pPr>
-      <w:bookmarkStart w:id="5" w:name="_Toc242216976"/>
+      <w:bookmarkStart w:id="5" w:name="_Toc242217873"/>
       <w:r>
         <w:rPr>
           <w:rFonts w:ascii="Times New Roman" w:eastAsia="Arial" w:hAnsi="Times New Roman"/>
@@ -3593,7 +3593,7 @@
         <w:pStyle w:val="1"/>
         <w:spacing w:before="280" w:after="120"/>
       </w:pPr>
-      <w:bookmarkStart w:id="6" w:name="_Toc242216977"/>
+      <w:bookmarkStart w:id="6" w:name="_Toc242217874"/>
       <w:r>
         <w:rPr>
           <w:rFonts w:ascii="Times New Roman" w:eastAsia="Arial" w:hAnsi="Times New Roman"/>
@@ -3799,7 +3799,7 @@
         <w:pStyle w:val="1"/>
         <w:spacing w:before="280" w:after="120"/>
       </w:pPr>
-      <w:bookmarkStart w:id="7" w:name="_Toc242216978"/>
+      <w:bookmarkStart w:id="7" w:name="_Toc242217875"/>
       <w:r>
         <w:rPr>
           <w:rFonts w:ascii="Times New Roman" w:eastAsia="Arial" w:hAnsi="Times New Roman"/>
@@ -3943,7 +3943,7 @@
         <w:pStyle w:val="1"/>
         <w:spacing w:before="280" w:after="120"/>
       </w:pPr>
-      <w:bookmarkStart w:id="8" w:name="_Toc242216979"/>
+      <w:bookmarkStart w:id="8" w:name="_Toc242217876"/>
       <w:r>
         <w:rPr>
           <w:rFonts w:ascii="Times New Roman" w:eastAsia="Arial" w:hAnsi="Times New Roman"/>
@@ -4252,7 +4252,7 @@
         <w:pStyle w:val="1"/>
         <w:spacing w:before="280" w:after="120"/>
       </w:pPr>
-      <w:bookmarkStart w:id="9" w:name="_Toc242216980"/>
+      <w:bookmarkStart w:id="9" w:name="_Toc242217877"/>
       <w:r>
         <w:rPr>
           <w:rFonts w:ascii="Times New Roman" w:eastAsia="Arial" w:hAnsi="Times New Roman"/>
@@ -4348,7 +4348,7 @@
         <w:pStyle w:val="1"/>
         <w:spacing w:before="280" w:after="120"/>
       </w:pPr>
-      <w:bookmarkStart w:id="10" w:name="_Toc242216981"/>
+      <w:bookmarkStart w:id="10" w:name="_Toc242217878"/>
       <w:r>
         <w:rPr>
           <w:rFonts w:ascii="Times New Roman" w:eastAsia="Arial" w:hAnsi="Times New Roman"/>
@@ -4454,7 +4454,7 @@
         <w:pStyle w:val="1"/>
         <w:spacing w:before="280" w:after="120"/>
       </w:pPr>
-      <w:bookmarkStart w:id="11" w:name="_Toc242216982"/>
+      <w:bookmarkStart w:id="11" w:name="_Toc242217879"/>
       <w:r>
         <w:rPr>
           <w:rFonts w:ascii="Times New Roman" w:eastAsia="Arial" w:hAnsi="Times New Roman"/>
@@ -4619,7 +4619,7 @@
         <w:pStyle w:val="1"/>
         <w:spacing w:before="280" w:after="120"/>
       </w:pPr>
-      <w:bookmarkStart w:id="12" w:name="_Toc242216983"/>
+      <w:bookmarkStart w:id="12" w:name="_Toc242217880"/>
       <w:r>
         <w:rPr>
           <w:rFonts w:ascii="Times New Roman" w:eastAsia="Arial" w:hAnsi="Times New Roman"/>
@@ -4857,7 +4857,7 @@
         <w:pStyle w:val="1"/>
         <w:spacing w:before="280" w:after="120"/>
       </w:pPr>
-      <w:bookmarkStart w:id="13" w:name="_Toc242216984"/>
+      <w:bookmarkStart w:id="13" w:name="_Toc242217881"/>
       <w:r>
         <w:rPr>
           <w:rFonts w:ascii="Times New Roman" w:eastAsia="Arial" w:hAnsi="Times New Roman"/>
@@ -4978,15 +4978,23 @@
         <w:rPr>
           <w:color w:val="000000"/>
         </w:rPr>
-        <w:t xml:space="preserve"> is censored at the source floor. The analyst rating detail begins in June 2009,</w:t>
-      </w:r>
-    </w:p>
-    <w:p>
-      <w:r>
-        <w:rPr>
-          <w:color w:val="000000"/>
-        </w:rPr>
-        <w:t>so the 18.8% of analysts whose first report sits at that boundary cannot be ranked</w:t>
+        <w:t xml:space="preserve"> is censored at the source floor. The analyst rating detail begins in June 2009, measured rather than assumed (a query for</w:t>
+      </w:r>
+    </w:p>
+    <w:p>
+      <w:r>
+        <w:rPr>
+          <w:color w:val="000000"/>
+        </w:rPr>
+        <w:t>2009 returns 27,059 rows, for 2008 two, and the earliest first-report date we observe is</w:t>
+      </w:r>
+    </w:p>
+    <w:p>
+      <w:r>
+        <w:rPr>
+          <w:color w:val="000000"/>
+        </w:rPr>
+        <w:t>2009-06-15), so the 18.8% of analysts whose first report sits at that boundary cannot be ranked</w:t>
       </w:r>
     </w:p>
     <w:p>
@@ -5668,31 +5676,31 @@
       </w:rPr>
     </w:lvl>
   </w:abstractNum>
-  <w:num w:numId="1" w16cid:durableId="49118906">
+  <w:num w:numId="1" w16cid:durableId="316615723">
     <w:abstractNumId w:val="8"/>
   </w:num>
-  <w:num w:numId="2" w16cid:durableId="2082634342">
+  <w:num w:numId="2" w16cid:durableId="400249903">
     <w:abstractNumId w:val="6"/>
   </w:num>
-  <w:num w:numId="3" w16cid:durableId="779295819">
+  <w:num w:numId="3" w16cid:durableId="542063853">
     <w:abstractNumId w:val="5"/>
   </w:num>
-  <w:num w:numId="4" w16cid:durableId="133448475">
+  <w:num w:numId="4" w16cid:durableId="686100960">
     <w:abstractNumId w:val="4"/>
   </w:num>
-  <w:num w:numId="5" w16cid:durableId="205217931">
+  <w:num w:numId="5" w16cid:durableId="1515847819">
     <w:abstractNumId w:val="7"/>
   </w:num>
-  <w:num w:numId="6" w16cid:durableId="2099448340">
+  <w:num w:numId="6" w16cid:durableId="1403330224">
     <w:abstractNumId w:val="3"/>
   </w:num>
-  <w:num w:numId="7" w16cid:durableId="999651641">
+  <w:num w:numId="7" w16cid:durableId="2034646837">
     <w:abstractNumId w:val="2"/>
   </w:num>
-  <w:num w:numId="8" w16cid:durableId="367805276">
+  <w:num w:numId="8" w16cid:durableId="1633091774">
     <w:abstractNumId w:val="1"/>
   </w:num>
-  <w:num w:numId="9" w16cid:durableId="1283537656">
+  <w:num w:numId="9" w16cid:durableId="26611673">
     <w:abstractNumId w:val="0"/>
   </w:num>
 </w:numbering>
@@ -17091,14 +17099,14 @@
     <w:autoRedefine/>
     <w:uiPriority w:val="39"/>
     <w:unhideWhenUsed/>
-    <w:rsid w:val="005E40D3"/>
+    <w:rsid w:val="00250186"/>
   </w:style>
   <w:style w:type="character" w:styleId="aff9">
     <w:name w:val="Hyperlink"/>
     <w:basedOn w:val="a2"/>
     <w:uiPriority w:val="99"/>
     <w:unhideWhenUsed/>
-    <w:rsid w:val="005E40D3"/>
+    <w:rsid w:val="00250186"/>
     <w:rPr>
       <w:color w:val="0000FF" w:themeColor="hyperlink"/>
       <w:u w:val="single"/>

</xml_diff>

<commit_message>
Record that the 2009 floor is a coverage limit, tested six ways
For 2008, adding 全部A股, splitting into half-years and a single-stock query all return
nothing, while 2009 returns 27,059 rows in the same session.

Co-Authored-By: Claude Fable 5.1 <noreply@anthropic.com>
</commit_message>
<xml_diff>
--- a/Project10_Star_Analyst_Research_Plan_EN.docx
+++ b/Project10_Star_Analyst_Research_Plan_EN.docx
@@ -202,7 +202,7 @@
         </w:rPr>
         <w:fldChar w:fldCharType="separate"/>
       </w:r>
-      <w:hyperlink w:anchor="_Toc242217868" w:history="1">
+      <w:hyperlink w:anchor="_Toc242218499" w:history="1">
         <w:r>
           <w:rPr>
             <w:rStyle w:val="aff9"/>
@@ -240,7 +240,7 @@
             <w:noProof/>
             <w:webHidden/>
           </w:rPr>
-          <w:instrText>PAGEREF _Toc242217868 \h</w:instrText>
+          <w:instrText>PAGEREF _Toc242218499 \h</w:instrText>
         </w:r>
         <w:r>
           <w:rPr>
@@ -298,7 +298,7 @@
           <w14:ligatures w14:val="standardContextual"/>
         </w:rPr>
       </w:pPr>
-      <w:hyperlink w:anchor="_Toc242217869" w:history="1">
+      <w:hyperlink w:anchor="_Toc242218500" w:history="1">
         <w:r>
           <w:rPr>
             <w:rStyle w:val="aff9"/>
@@ -336,7 +336,7 @@
             <w:noProof/>
             <w:webHidden/>
           </w:rPr>
-          <w:instrText>PAGEREF _Toc242217869 \h</w:instrText>
+          <w:instrText>PAGEREF _Toc242218500 \h</w:instrText>
         </w:r>
         <w:r>
           <w:rPr>
@@ -394,7 +394,7 @@
           <w14:ligatures w14:val="standardContextual"/>
         </w:rPr>
       </w:pPr>
-      <w:hyperlink w:anchor="_Toc242217870" w:history="1">
+      <w:hyperlink w:anchor="_Toc242218501" w:history="1">
         <w:r>
           <w:rPr>
             <w:rStyle w:val="aff9"/>
@@ -432,7 +432,7 @@
             <w:noProof/>
             <w:webHidden/>
           </w:rPr>
-          <w:instrText>PAGEREF _Toc242217870 \h</w:instrText>
+          <w:instrText>PAGEREF _Toc242218501 \h</w:instrText>
         </w:r>
         <w:r>
           <w:rPr>
@@ -490,7 +490,7 @@
           <w14:ligatures w14:val="standardContextual"/>
         </w:rPr>
       </w:pPr>
-      <w:hyperlink w:anchor="_Toc242217871" w:history="1">
+      <w:hyperlink w:anchor="_Toc242218502" w:history="1">
         <w:r>
           <w:rPr>
             <w:rStyle w:val="aff9"/>
@@ -528,7 +528,7 @@
             <w:noProof/>
             <w:webHidden/>
           </w:rPr>
-          <w:instrText>PAGEREF _Toc242217871 \h</w:instrText>
+          <w:instrText>PAGEREF _Toc242218502 \h</w:instrText>
         </w:r>
         <w:r>
           <w:rPr>
@@ -586,7 +586,7 @@
           <w14:ligatures w14:val="standardContextual"/>
         </w:rPr>
       </w:pPr>
-      <w:hyperlink w:anchor="_Toc242217872" w:history="1">
+      <w:hyperlink w:anchor="_Toc242218503" w:history="1">
         <w:r>
           <w:rPr>
             <w:rStyle w:val="aff9"/>
@@ -624,7 +624,7 @@
             <w:noProof/>
             <w:webHidden/>
           </w:rPr>
-          <w:instrText>PAGEREF _Toc242217872 \h</w:instrText>
+          <w:instrText>PAGEREF _Toc242218503 \h</w:instrText>
         </w:r>
         <w:r>
           <w:rPr>
@@ -682,7 +682,7 @@
           <w14:ligatures w14:val="standardContextual"/>
         </w:rPr>
       </w:pPr>
-      <w:hyperlink w:anchor="_Toc242217873" w:history="1">
+      <w:hyperlink w:anchor="_Toc242218504" w:history="1">
         <w:r>
           <w:rPr>
             <w:rStyle w:val="aff9"/>
@@ -720,7 +720,7 @@
             <w:noProof/>
             <w:webHidden/>
           </w:rPr>
-          <w:instrText>PAGEREF _Toc242217873 \h</w:instrText>
+          <w:instrText>PAGEREF _Toc242218504 \h</w:instrText>
         </w:r>
         <w:r>
           <w:rPr>
@@ -778,7 +778,7 @@
           <w14:ligatures w14:val="standardContextual"/>
         </w:rPr>
       </w:pPr>
-      <w:hyperlink w:anchor="_Toc242217874" w:history="1">
+      <w:hyperlink w:anchor="_Toc242218505" w:history="1">
         <w:r>
           <w:rPr>
             <w:rStyle w:val="aff9"/>
@@ -816,7 +816,7 @@
             <w:noProof/>
             <w:webHidden/>
           </w:rPr>
-          <w:instrText>PAGEREF _Toc242217874 \h</w:instrText>
+          <w:instrText>PAGEREF _Toc242218505 \h</w:instrText>
         </w:r>
         <w:r>
           <w:rPr>
@@ -874,7 +874,7 @@
           <w14:ligatures w14:val="standardContextual"/>
         </w:rPr>
       </w:pPr>
-      <w:hyperlink w:anchor="_Toc242217875" w:history="1">
+      <w:hyperlink w:anchor="_Toc242218506" w:history="1">
         <w:r>
           <w:rPr>
             <w:rStyle w:val="aff9"/>
@@ -912,7 +912,7 @@
             <w:noProof/>
             <w:webHidden/>
           </w:rPr>
-          <w:instrText>PAGEREF _Toc242217875 \h</w:instrText>
+          <w:instrText>PAGEREF _Toc242218506 \h</w:instrText>
         </w:r>
         <w:r>
           <w:rPr>
@@ -970,7 +970,7 @@
           <w14:ligatures w14:val="standardContextual"/>
         </w:rPr>
       </w:pPr>
-      <w:hyperlink w:anchor="_Toc242217876" w:history="1">
+      <w:hyperlink w:anchor="_Toc242218507" w:history="1">
         <w:r>
           <w:rPr>
             <w:rStyle w:val="aff9"/>
@@ -1008,7 +1008,7 @@
             <w:noProof/>
             <w:webHidden/>
           </w:rPr>
-          <w:instrText>PAGEREF _Toc242217876 \h</w:instrText>
+          <w:instrText>PAGEREF _Toc242218507 \h</w:instrText>
         </w:r>
         <w:r>
           <w:rPr>
@@ -1066,7 +1066,7 @@
           <w14:ligatures w14:val="standardContextual"/>
         </w:rPr>
       </w:pPr>
-      <w:hyperlink w:anchor="_Toc242217877" w:history="1">
+      <w:hyperlink w:anchor="_Toc242218508" w:history="1">
         <w:r>
           <w:rPr>
             <w:rStyle w:val="aff9"/>
@@ -1104,7 +1104,7 @@
             <w:noProof/>
             <w:webHidden/>
           </w:rPr>
-          <w:instrText>PAGEREF _Toc242217877 \h</w:instrText>
+          <w:instrText>PAGEREF _Toc242218508 \h</w:instrText>
         </w:r>
         <w:r>
           <w:rPr>
@@ -1162,7 +1162,7 @@
           <w14:ligatures w14:val="standardContextual"/>
         </w:rPr>
       </w:pPr>
-      <w:hyperlink w:anchor="_Toc242217878" w:history="1">
+      <w:hyperlink w:anchor="_Toc242218509" w:history="1">
         <w:r>
           <w:rPr>
             <w:rStyle w:val="aff9"/>
@@ -1200,7 +1200,7 @@
             <w:noProof/>
             <w:webHidden/>
           </w:rPr>
-          <w:instrText>PAGEREF _Toc242217878 \h</w:instrText>
+          <w:instrText>PAGEREF _Toc242218509 \h</w:instrText>
         </w:r>
         <w:r>
           <w:rPr>
@@ -1258,7 +1258,7 @@
           <w14:ligatures w14:val="standardContextual"/>
         </w:rPr>
       </w:pPr>
-      <w:hyperlink w:anchor="_Toc242217879" w:history="1">
+      <w:hyperlink w:anchor="_Toc242218510" w:history="1">
         <w:r>
           <w:rPr>
             <w:rStyle w:val="aff9"/>
@@ -1296,7 +1296,7 @@
             <w:noProof/>
             <w:webHidden/>
           </w:rPr>
-          <w:instrText>PAGEREF _Toc242217879 \h</w:instrText>
+          <w:instrText>PAGEREF _Toc242218510 \h</w:instrText>
         </w:r>
         <w:r>
           <w:rPr>
@@ -1354,7 +1354,7 @@
           <w14:ligatures w14:val="standardContextual"/>
         </w:rPr>
       </w:pPr>
-      <w:hyperlink w:anchor="_Toc242217880" w:history="1">
+      <w:hyperlink w:anchor="_Toc242218511" w:history="1">
         <w:r>
           <w:rPr>
             <w:rStyle w:val="aff9"/>
@@ -1392,7 +1392,7 @@
             <w:noProof/>
             <w:webHidden/>
           </w:rPr>
-          <w:instrText>PAGEREF _Toc242217880 \h</w:instrText>
+          <w:instrText>PAGEREF _Toc242218511 \h</w:instrText>
         </w:r>
         <w:r>
           <w:rPr>
@@ -1450,7 +1450,7 @@
           <w14:ligatures w14:val="standardContextual"/>
         </w:rPr>
       </w:pPr>
-      <w:hyperlink w:anchor="_Toc242217881" w:history="1">
+      <w:hyperlink w:anchor="_Toc242218512" w:history="1">
         <w:r>
           <w:rPr>
             <w:rStyle w:val="aff9"/>
@@ -1488,7 +1488,7 @@
             <w:noProof/>
             <w:webHidden/>
           </w:rPr>
-          <w:instrText>PAGEREF _Toc242217881 \h</w:instrText>
+          <w:instrText>PAGEREF _Toc242218512 \h</w:instrText>
         </w:r>
         <w:r>
           <w:rPr>
@@ -1543,7 +1543,7 @@
         <w:pStyle w:val="1"/>
         <w:spacing w:before="280" w:after="120"/>
       </w:pPr>
-      <w:bookmarkStart w:id="0" w:name="_Toc242217868"/>
+      <w:bookmarkStart w:id="0" w:name="_Toc242218499"/>
       <w:r>
         <w:rPr>
           <w:rFonts w:ascii="Times New Roman" w:eastAsia="Arial" w:hAnsi="Times New Roman"/>
@@ -1992,7 +1992,7 @@
         <w:pStyle w:val="1"/>
         <w:spacing w:before="280" w:after="120"/>
       </w:pPr>
-      <w:bookmarkStart w:id="1" w:name="_Toc242217869"/>
+      <w:bookmarkStart w:id="1" w:name="_Toc242218500"/>
       <w:r>
         <w:rPr>
           <w:rFonts w:ascii="Times New Roman" w:eastAsia="Arial" w:hAnsi="Times New Roman"/>
@@ -2040,7 +2040,7 @@
         <w:pStyle w:val="1"/>
         <w:spacing w:before="280" w:after="120"/>
       </w:pPr>
-      <w:bookmarkStart w:id="2" w:name="_Toc242217870"/>
+      <w:bookmarkStart w:id="2" w:name="_Toc242218501"/>
       <w:r>
         <w:rPr>
           <w:rFonts w:ascii="Times New Roman" w:eastAsia="Arial" w:hAnsi="Times New Roman"/>
@@ -2460,7 +2460,7 @@
         <w:pStyle w:val="1"/>
         <w:spacing w:before="280" w:after="120"/>
       </w:pPr>
-      <w:bookmarkStart w:id="3" w:name="_Toc242217871"/>
+      <w:bookmarkStart w:id="3" w:name="_Toc242218502"/>
       <w:r>
         <w:rPr>
           <w:rFonts w:ascii="Times New Roman" w:eastAsia="Arial" w:hAnsi="Times New Roman"/>
@@ -2967,7 +2967,7 @@
         <w:pStyle w:val="1"/>
         <w:spacing w:before="280" w:after="120"/>
       </w:pPr>
-      <w:bookmarkStart w:id="4" w:name="_Toc242217872"/>
+      <w:bookmarkStart w:id="4" w:name="_Toc242218503"/>
       <w:r>
         <w:rPr>
           <w:rFonts w:ascii="Times New Roman" w:eastAsia="Arial" w:hAnsi="Times New Roman"/>
@@ -3421,7 +3421,7 @@
         <w:pStyle w:val="1"/>
         <w:spacing w:before="280" w:after="120"/>
       </w:pPr>
-      <w:bookmarkStart w:id="5" w:name="_Toc242217873"/>
+      <w:bookmarkStart w:id="5" w:name="_Toc242218504"/>
       <w:r>
         <w:rPr>
           <w:rFonts w:ascii="Times New Roman" w:eastAsia="Arial" w:hAnsi="Times New Roman"/>
@@ -3593,7 +3593,7 @@
         <w:pStyle w:val="1"/>
         <w:spacing w:before="280" w:after="120"/>
       </w:pPr>
-      <w:bookmarkStart w:id="6" w:name="_Toc242217874"/>
+      <w:bookmarkStart w:id="6" w:name="_Toc242218505"/>
       <w:r>
         <w:rPr>
           <w:rFonts w:ascii="Times New Roman" w:eastAsia="Arial" w:hAnsi="Times New Roman"/>
@@ -3799,7 +3799,7 @@
         <w:pStyle w:val="1"/>
         <w:spacing w:before="280" w:after="120"/>
       </w:pPr>
-      <w:bookmarkStart w:id="7" w:name="_Toc242217875"/>
+      <w:bookmarkStart w:id="7" w:name="_Toc242218506"/>
       <w:r>
         <w:rPr>
           <w:rFonts w:ascii="Times New Roman" w:eastAsia="Arial" w:hAnsi="Times New Roman"/>
@@ -3943,7 +3943,7 @@
         <w:pStyle w:val="1"/>
         <w:spacing w:before="280" w:after="120"/>
       </w:pPr>
-      <w:bookmarkStart w:id="8" w:name="_Toc242217876"/>
+      <w:bookmarkStart w:id="8" w:name="_Toc242218507"/>
       <w:r>
         <w:rPr>
           <w:rFonts w:ascii="Times New Roman" w:eastAsia="Arial" w:hAnsi="Times New Roman"/>
@@ -4252,7 +4252,7 @@
         <w:pStyle w:val="1"/>
         <w:spacing w:before="280" w:after="120"/>
       </w:pPr>
-      <w:bookmarkStart w:id="9" w:name="_Toc242217877"/>
+      <w:bookmarkStart w:id="9" w:name="_Toc242218508"/>
       <w:r>
         <w:rPr>
           <w:rFonts w:ascii="Times New Roman" w:eastAsia="Arial" w:hAnsi="Times New Roman"/>
@@ -4348,7 +4348,7 @@
         <w:pStyle w:val="1"/>
         <w:spacing w:before="280" w:after="120"/>
       </w:pPr>
-      <w:bookmarkStart w:id="10" w:name="_Toc242217878"/>
+      <w:bookmarkStart w:id="10" w:name="_Toc242218509"/>
       <w:r>
         <w:rPr>
           <w:rFonts w:ascii="Times New Roman" w:eastAsia="Arial" w:hAnsi="Times New Roman"/>
@@ -4454,7 +4454,7 @@
         <w:pStyle w:val="1"/>
         <w:spacing w:before="280" w:after="120"/>
       </w:pPr>
-      <w:bookmarkStart w:id="11" w:name="_Toc242217879"/>
+      <w:bookmarkStart w:id="11" w:name="_Toc242218510"/>
       <w:r>
         <w:rPr>
           <w:rFonts w:ascii="Times New Roman" w:eastAsia="Arial" w:hAnsi="Times New Roman"/>
@@ -4619,7 +4619,7 @@
         <w:pStyle w:val="1"/>
         <w:spacing w:before="280" w:after="120"/>
       </w:pPr>
-      <w:bookmarkStart w:id="12" w:name="_Toc242217880"/>
+      <w:bookmarkStart w:id="12" w:name="_Toc242218511"/>
       <w:r>
         <w:rPr>
           <w:rFonts w:ascii="Times New Roman" w:eastAsia="Arial" w:hAnsi="Times New Roman"/>
@@ -4857,7 +4857,7 @@
         <w:pStyle w:val="1"/>
         <w:spacing w:before="280" w:after="120"/>
       </w:pPr>
-      <w:bookmarkStart w:id="13" w:name="_Toc242217881"/>
+      <w:bookmarkStart w:id="13" w:name="_Toc242218512"/>
       <w:r>
         <w:rPr>
           <w:rFonts w:ascii="Times New Roman" w:eastAsia="Arial" w:hAnsi="Times New Roman"/>
@@ -4994,7 +4994,15 @@
         <w:rPr>
           <w:color w:val="000000"/>
         </w:rPr>
-        <w:t>2009-06-15), so the 18.8% of analysts whose first report sits at that boundary cannot be ranked</w:t>
+        <w:t>2009-06-15; that is a coverage limit, not a query problem, since for 2008 the</w:t>
+      </w:r>
+    </w:p>
+    <w:p>
+      <w:r>
+        <w:rPr>
+          <w:color w:val="000000"/>
+        </w:rPr>
+        <w:t>alternative wordings, half-year splits and a single-stock query all return nothing), so the 18.8% of analysts whose first report sits at that boundary cannot be ranked</w:t>
       </w:r>
     </w:p>
     <w:p>
@@ -5676,31 +5684,31 @@
       </w:rPr>
     </w:lvl>
   </w:abstractNum>
-  <w:num w:numId="1" w16cid:durableId="316615723">
+  <w:num w:numId="1" w16cid:durableId="1566725214">
     <w:abstractNumId w:val="8"/>
   </w:num>
-  <w:num w:numId="2" w16cid:durableId="400249903">
+  <w:num w:numId="2" w16cid:durableId="2030179537">
     <w:abstractNumId w:val="6"/>
   </w:num>
-  <w:num w:numId="3" w16cid:durableId="542063853">
+  <w:num w:numId="3" w16cid:durableId="1613397667">
     <w:abstractNumId w:val="5"/>
   </w:num>
-  <w:num w:numId="4" w16cid:durableId="686100960">
+  <w:num w:numId="4" w16cid:durableId="401414052">
     <w:abstractNumId w:val="4"/>
   </w:num>
-  <w:num w:numId="5" w16cid:durableId="1515847819">
+  <w:num w:numId="5" w16cid:durableId="1050424885">
     <w:abstractNumId w:val="7"/>
   </w:num>
-  <w:num w:numId="6" w16cid:durableId="1403330224">
+  <w:num w:numId="6" w16cid:durableId="863136144">
     <w:abstractNumId w:val="3"/>
   </w:num>
-  <w:num w:numId="7" w16cid:durableId="2034646837">
+  <w:num w:numId="7" w16cid:durableId="553005119">
     <w:abstractNumId w:val="2"/>
   </w:num>
-  <w:num w:numId="8" w16cid:durableId="1633091774">
+  <w:num w:numId="8" w16cid:durableId="2074429709">
     <w:abstractNumId w:val="1"/>
   </w:num>
-  <w:num w:numId="9" w16cid:durableId="26611673">
+  <w:num w:numId="9" w16cid:durableId="608005638">
     <w:abstractNumId w:val="0"/>
   </w:num>
 </w:numbering>
@@ -17099,14 +17107,14 @@
     <w:autoRedefine/>
     <w:uiPriority w:val="39"/>
     <w:unhideWhenUsed/>
-    <w:rsid w:val="00250186"/>
+    <w:rsid w:val="00E73D5E"/>
   </w:style>
   <w:style w:type="character" w:styleId="aff9">
     <w:name w:val="Hyperlink"/>
     <w:basedOn w:val="a2"/>
     <w:uiPriority w:val="99"/>
     <w:unhideWhenUsed/>
-    <w:rsid w:val="00250186"/>
+    <w:rsid w:val="00E73D5E"/>
     <w:rPr>
       <w:color w:val="0000FF" w:themeColor="hyperlink"/>
       <w:u w:val="single"/>

</xml_diff>